<commit_message>
Task 2 documentation; every figure traced to a published artefact
</commit_message>
<xml_diff>
--- a/docs/Task2_Training_Pipeline.docx
+++ b/docs/Task2_Training_Pipeline.docx
@@ -37,7 +37,7 @@
         <w:rPr>
           <w:i w:val="0"/>
         </w:rPr>
-        <w:t>The brief lists five requirements. Where each is satisfied is stated first, so the rest of this document can be about the decisions rather than about compliance.</w:t>
+        <w:t>The brief lists five requirements. Where each is met is stated first, so the rest of the document can be about the decisions rather than about compliance.</w:t>
       </w:r>
     </w:p>
     <w:tbl>
@@ -171,7 +171,7 @@
                 <w:b w:val="0"/>
                 <w:sz w:val="18"/>
               </w:rPr>
-              <w:t>openai/whisper-large-v3, 1.55 B parameters</w:t>
+              <w:t>openai/whisper-large-v3 — 1,559,219,200 parameters</w:t>
             </w:r>
           </w:p>
         </w:tc>
@@ -212,7 +212,7 @@
                 <w:b w:val="0"/>
                 <w:sz w:val="18"/>
               </w:rPr>
-              <w:t>6,270 optimizer steps — ceil(ceil(33,432/8)/2) × 3</w:t>
+              <w:t>6,270 optimizer steps = ceil(ceil(33,432 / 8) / 2) × 3</w:t>
             </w:r>
           </w:p>
         </w:tc>
@@ -253,7 +253,7 @@
                 <w:b w:val="0"/>
                 <w:sz w:val="18"/>
               </w:rPr>
-              <w:t>computed every 1,500 steps by free generation, not teacher forcing</w:t>
+              <w:t>every 1,500 steps by free autoregressive generation, not teacher forcing</w:t>
             </w:r>
           </w:p>
         </w:tc>
@@ -294,7 +294,7 @@
                 <w:b w:val="0"/>
                 <w:sz w:val="18"/>
               </w:rPr>
-              <w:t>load_best_model_at_end on validation WER</w:t>
+              <w:t>load_best_model_at_end selecting on validation WER</w:t>
             </w:r>
           </w:p>
         </w:tc>
@@ -316,7 +316,21 @@
         <w:rPr>
           <w:b w:val="0"/>
         </w:rPr>
-        <w:t>WER 8.05% and CER 2.00% on the full 5,900-sample validation split, trained in 14 h 19 min on a single 24 GB NVIDIA L4.</w:t>
+        <w:t>WER 8.05% and CER 2.00% on the full 5,900-sample validation split.</w:t>
+      </w:r>
+    </w:p>
+    <w:p>
+      <w:r>
+        <w:rPr>
+          <w:b/>
+        </w:rPr>
+        <w:t xml:space="preserve">On sourcing. </w:t>
+      </w:r>
+      <w:r>
+        <w:rPr>
+          <w:b w:val="0"/>
+        </w:rPr>
+        <w:t>Every measured figure below comes from an artefact published alongside the model. collect_run_facts.py re-reads them and prints these numbers on demand.</w:t>
       </w:r>
     </w:p>
     <w:p>
@@ -332,7 +346,7 @@
         <w:rPr>
           <w:i w:val="0"/>
         </w:rPr>
-        <w:t>The pipeline is fed from two sources joined at load time. Text comes from the cleaned CSVs produced in Task 1 — sample id, duration, raw transcript, normalised transcript, and no audio. Audio was deliberately left out of the Task 1 output because embedding it would have produced multi-gigabyte CSVs. The waveforms come from the original dataset on the HuggingFace Hub, which still holds all 40,008 recordings.</w:t>
+        <w:t>The pipeline is fed from two sources joined at load time. Text comes from the cleaned CSVs produced in Task 1 — sample id, duration, raw transcript, normalised transcript, and no audio, because embedding audio would have produced multi-gigabyte CSVs. The waveforms come from the original dataset on the HuggingFace Hub, which still holds all 40,008 recordings.</w:t>
       </w:r>
     </w:p>
     <w:p>
@@ -351,7 +365,7 @@
         <w:rPr>
           <w:i w:val="0"/>
         </w:rPr>
-        <w:t>This is the single most consequential decision in the data path. The two sources are matched on the unique id, because matching on transcript text cannot work on this corpus:</w:t>
+        <w:t>This is the most consequential decision in the data path. Matching on transcript text cannot work on this corpus:</w:t>
       </w:r>
     </w:p>
     <w:tbl>
@@ -545,31 +559,7 @@
         <w:rPr>
           <w:i w:val="0"/>
         </w:rPr>
-        <w:t>With 59% of rows sharing a transcript with some other row, a text-based join has no way to decide which recording belongs to which row. It would not fail — it would quietly attach an arbitrary recording of the same sentence, producing a dataset that looks correct and trains to a plausible loss curve while every affected pair is mismatched. This was in fact the original implementation and is one of the four defects described in section 7.</w:t>
-      </w:r>
-    </w:p>
-    <w:p>
-      <w:r>
-        <w:rPr>
-          <w:i w:val="0"/>
-        </w:rPr>
-        <w:t>All 39,332 CSV rows found their audio. The 676 rows removed during Task 1 cleaning still exist on the Hub, but their ids are absent from the CSVs, so they never enter training. The cleaning decisions are therefore enforced by which ids exist rather than recomputed — there is one place where a row can be excluded, not two that could disagree.</w:t>
-      </w:r>
-    </w:p>
-    <w:p>
-      <w:r>
-        <w:rPr>
-          <w:i w:val="0"/>
-        </w:rPr>
-        <w:t>Two guards run immediately after the join: the pipeline aborts if any id appears in both splits, and it probes a sample to confirm the attached transcript belongs to that specific row rather than to a different recording of the same sentence.</w:t>
-      </w:r>
-    </w:p>
-    <w:p>
-      <w:pPr>
-        <w:pStyle w:val="Heading2"/>
-      </w:pPr>
-      <w:r>
-        <w:t>End-to-end flow</w:t>
+        <w:t>With 59% of rows sharing a transcript with some other row, a text-based join has no way to decide which recording belongs to which row. It would not fail — it would quietly attach an arbitrary recording of the same sentence, producing a dataset that looks correct and trains to a plausible loss curve while every affected pair is mismatched. This was in fact the original implementation, and is one of the four defects in section 7.</w:t>
       </w:r>
     </w:p>
     <w:p>
@@ -582,17 +572,27 @@
           <w:rFonts w:ascii="Consolas" w:hAnsi="Consolas"/>
           <w:sz w:val="17"/>
         </w:rPr>
-        <w:t>train.csv + val.csv  (39,332 rows, text only)</w:t>
+        <w:t>[MATCH] Matched 39,332 / 39,332 CSV rows to audio (train=33,432, val=5,900)</w:t>
         <w:br/>
-        <w:t xml:space="preserve">        +  HF Hub dataset  (40,008 recordings, audio only)</w:t>
+        <w:t>[SPLIT] Train: 33,432 samples, Validation: 5,900 samples</w:t>
         <w:br/>
-        <w:t xml:space="preserve">  -&gt;  join on id  -&gt;  39,332 paired samples</w:t>
-        <w:br/>
-        <w:t xml:space="preserve">  -&gt;  preprocess: trim, normalise, log-Mel 128x3000, tokenise</w:t>
-        <w:br/>
-        <w:t xml:space="preserve">  -&gt;  QLoRA fine-tune, 3 epochs / 6,270 steps</w:t>
-        <w:br/>
-        <w:t xml:space="preserve">  -&gt;  WER 8.05%  CER 2.00%</w:t>
+        <w:t>[VERIFY] Label alignment OK (probed id=0)</w:t>
+      </w:r>
+    </w:p>
+    <w:p>
+      <w:r>
+        <w:rPr>
+          <w:i w:val="0"/>
+        </w:rPr>
+        <w:t>All 39,332 CSV rows found their audio. The 676 rows removed during Task 1 cleaning still exist on the Hub, but their ids are absent from the CSVs, so they never enter training. Cleaning decisions are enforced by which ids exist rather than recomputed — one place where a row can be excluded, not two that could disagree.</w:t>
+      </w:r>
+    </w:p>
+    <w:p>
+      <w:r>
+        <w:rPr>
+          <w:i w:val="0"/>
+        </w:rPr>
+        <w:t>Two guards run immediately after the join, both visible above: the pipeline aborts if any id appears in both splits, and it probes a sample to confirm the attached transcript belongs to that specific row rather than to a different recording of the same sentence.</w:t>
       </w:r>
     </w:p>
     <w:p>
@@ -640,7 +640,7 @@
         <w:rPr>
           <w:b w:val="0"/>
         </w:rPr>
-        <w:t>The audio column is loaded undecoded, with Audio(decode=False), and decoded explicitly with soundfile. Recent versions of the datasets library return a torchcodec AudioDecoder object rather than the classic array/sampling-rate dictionary, so decoding manually makes the pipeline behave identically across library versions instead of depending on which representation the installed one happens to return. Stereo is averaged to mono and cast to float32. Anything not already at 16 kHz is resampled: Whisper's feature extractor assumes 16 kHz, and feeding it another rate while declaring 16 kHz would time-stretch the audio and silently destroy audio–text alignment.</w:t>
+        <w:t>The audio column is loaded undecoded, with Audio(decode=False), and decoded explicitly with soundfile. Recent versions of the datasets library return a torchcodec AudioDecoder object rather than the classic array/sampling-rate dictionary, so decoding manually makes the pipeline behave identically across library versions instead of depending on which representation the installed one happens to return. Stereo is averaged to mono and cast to float32. Anything not already at 16 kHz is resampled: Whisper's feature extractor assumes 16 kHz, and feeding it another rate while declaring 16 kHz would time-stretch the audio and destroy audio–text alignment.</w:t>
       </w:r>
     </w:p>
     <w:p>
@@ -648,13 +648,28 @@
         <w:rPr>
           <w:b/>
         </w:rPr>
-        <w:t xml:space="preserve">Silence trimming. </w:t>
+        <w:t xml:space="preserve">Silence trimming and peak normalisation. </w:t>
       </w:r>
       <w:r>
         <w:rPr>
           <w:b w:val="0"/>
         </w:rPr>
-        <w:t>Task 1 found 28.06% of samples below 8 characters per second — the profile of a short transcript stretched over a long recording. Since Whisper's decoder hallucinates over silence, leading and trailing silence is removed before feature extraction. The implementation is energy-based: 20 ms frames, RMS energy per frame, frames quieter than 40 dB below the loudest treated as silence, with a 100 ms margin kept on both sides so word onsets are never clipped.</w:t>
+        <w:t>Both exist because of Task 1 findings — 28.06% of clips below 8 characters per second (the profile of a short transcript over a long recording) and 22.10% touching the digital ceiling. Trimming is energy-based: 20 ms frames, RMS energy per frame, frames quieter than 40 dB below the loudest treated as silence. Normalisation is a single scalar multiplication to a peak of −3 dBFS, so the waveform shape is unchanged and the output can never clip. It cannot repair clipping — that information is gone — but it gives the corpus a consistent dynamic range across speakers who recorded at very different levels. The settings are logged at the start of every run:</w:t>
+      </w:r>
+    </w:p>
+    <w:p>
+      <w:pPr>
+        <w:spacing w:after="140" w:before="40"/>
+        <w:ind w:left="216"/>
+      </w:pPr>
+      <w:r>
+        <w:rPr>
+          <w:rFonts w:ascii="Consolas" w:hAnsi="Consolas"/>
+          <w:sz w:val="17"/>
+        </w:rPr>
+        <w:t>[AUDIO PREP] VAD silence trim: ON (top_db=40.0, margin=100.0ms, min_duration=1.0s)</w:t>
+        <w:br/>
+        <w:t xml:space="preserve">             | peak normalisation: ON (-3.0 dBFS)</w:t>
       </w:r>
     </w:p>
     <w:p>
@@ -666,7 +681,7 @@
         <w:rPr>
           <w:b/>
         </w:rPr>
-        <w:t xml:space="preserve">Two constraints. </w:t>
+        <w:t xml:space="preserve">Three constraints. </w:t>
       </w:r>
       <w:r>
         <w:t>Only the edges are trimmed. Pauses inside an utterance are speech rhythm; removing them would teach an unnatural cadence.</w:t>
@@ -675,24 +690,19 @@
     <w:p>
       <w:pPr>
         <w:pStyle w:val="ListBullet"/>
+        <w:spacing w:after="40"/>
+      </w:pPr>
+      <w:r>
+        <w:t>A 100 ms margin is kept on both sides, so word onsets are never clipped.</w:t>
+      </w:r>
+    </w:p>
+    <w:p>
+      <w:pPr>
+        <w:pStyle w:val="ListBullet"/>
         <w:spacing w:after="120"/>
       </w:pPr>
       <w:r>
-        <w:t>If trimming would leave under 1.0 second, the original signal is returned unchanged, so an over-aggressive trim can never destroy a short sample.</w:t>
-      </w:r>
-    </w:p>
-    <w:p>
-      <w:r>
-        <w:rPr>
-          <w:b/>
-        </w:rPr>
-        <w:t xml:space="preserve">Peak normalisation. </w:t>
-      </w:r>
-      <w:r>
-        <w:rPr>
-          <w:b w:val="0"/>
-        </w:rPr>
-        <w:t>Task 1 found 22.10% of samples touching the digital ceiling. Normalisation cannot recover what clipping destroyed — that information is gone — but scaling every clip to a common peak of −3 dBFS gives the corpus a consistent dynamic range across speakers who recorded at very different levels. It is a single scalar multiplication, so the waveform shape is unchanged and no distortion is introduced, and because the target sits below full scale the output can never clip.</w:t>
+        <w:t>If trimming would leave under 1.0 second the original signal is returned unchanged, so an over-aggressive trim can never destroy a short sample.</w:t>
       </w:r>
     </w:p>
     <w:p>
@@ -720,7 +730,7 @@
         <w:rPr>
           <w:b w:val="0"/>
         </w:rPr>
-        <w:t>Neither step reduces training time. Whisper pads every input to exactly 30 seconds regardless of true duration, so shortening a clip only replaces real silence with padding silence. Both are quality measures addressing findings from Task 1, not performance optimisations, and are presented as such.</w:t>
+        <w:t>Neither step reduces training time. Whisper pads every input to exactly 30 seconds regardless of true duration, so shortening a clip only replaces real silence with padding silence. Both are quality measures addressing Task 1 findings, not performance optimisations, and are presented as such.</w:t>
       </w:r>
     </w:p>
     <w:p>
@@ -734,7 +744,7 @@
         <w:rPr>
           <w:b w:val="0"/>
         </w:rPr>
-        <w:t>Undecodable audio is flagged and dropped rather than replaced with silence, and a failure rate above 0.5% aborts the run. All 33,432 training and 5,900 validation samples decoded successfully.</w:t>
+        <w:t>Undecodable audio is flagged and dropped rather than replaced with silence, and a failure rate above 0.5% aborts the run. No decode failures were logged: all 33,432 training and 5,900 validation samples decoded successfully.</w:t>
       </w:r>
     </w:p>
     <w:p>
@@ -750,7 +760,7 @@
         <w:rPr>
           <w:i w:val="0"/>
         </w:rPr>
-        <w:t>Batches are assembled by a custom collator that pads mel features and labels separately. Mel features are already uniform at 128 × 3000; labels are padded with the tokenizer and the padded positions are then replaced with −100, the value PyTorch's cross-entropy ignores, so padding contributes nothing to the loss.</w:t>
+        <w:t>Batches are assembled by a custom collator that pads mel features and labels separately. Mel features are already uniform at 128 × 3000; labels are padded with the tokenizer and the padded positions replaced with −100, the value PyTorch's cross-entropy ignores, so padding contributes nothing to the loss.</w:t>
       </w:r>
     </w:p>
     <w:p>
@@ -764,7 +774,7 @@
         <w:rPr>
           <w:b w:val="0"/>
         </w:rPr>
-        <w:t>A tokenised Persian label begins with four special tokens: &lt;|startoftranscript|&gt; (50258), &lt;|fa|&gt;, &lt;|transcribe|&gt;, &lt;|notimestamps|&gt;. Whisper's shift_tokens_right prepends decoder_start_token_id automatically when it builds decoder inputs, so if the label still carries its own leading 50258 the decoder receives the prefix twice. The collator therefore strips it — and the comparison must be against decoder_start_token_id (50258), not bos_token_id, which for Whisper is &lt;|endoftext|&gt; (50257) and consequently never matches. Getting this wrong produces no error and no obviously wrong loss curve; see section 7.</w:t>
+        <w:t>A tokenised Persian label begins with four special tokens: &lt;|startoftranscript|&gt; (50258), &lt;|fa|&gt;, &lt;|transcribe|&gt;, &lt;|notimestamps|&gt;. Whisper's shift_tokens_right prepends decoder_start_token_id automatically when building decoder inputs, so a label that still carries its own leading 50258 gives the decoder that prefix twice. The collator strips it — and the comparison must be against decoder_start_token_id (50258), not bos_token_id, which for Whisper is &lt;|endoftext|&gt; (50257) and therefore never matches. Getting this wrong produces no error and no obviously wrong loss curve; see section 7.</w:t>
       </w:r>
     </w:p>
     <w:p>
@@ -1184,11 +1194,28 @@
       </w:pPr>
     </w:p>
     <w:p>
+      <w:pPr>
+        <w:spacing w:after="140" w:before="40"/>
+        <w:ind w:left="216"/>
+      </w:pPr>
+      <w:r>
+        <w:rPr>
+          <w:rFonts w:ascii="Consolas" w:hAnsi="Consolas"/>
+          <w:sz w:val="17"/>
+        </w:rPr>
+        <w:t>trainable params: 15,728,640 || all params: 1,559,219,200 || trainable%: 1.0088</w:t>
+        <w:br/>
+        <w:t>[PRECISION] quantization=4-bit NF4 | fp16=True | bf16=False</w:t>
+        <w:br/>
+        <w:t>[GPU] NVIDIA L4 | compute capability 8.9 | 22.0 GiB</w:t>
+      </w:r>
+    </w:p>
+    <w:p>
       <w:r>
         <w:rPr>
           <w:i w:val="0"/>
         </w:rPr>
-        <w:t>QLoRA in one sentence: the base model is frozen and stored in 4 bits, small low-rank matrices are injected beside the attention projections, and only those are trained. 1.01% of 1.56 billion parameters receive gradients.</w:t>
+        <w:t>QLoRA in one sentence: the base model is frozen and stored in 4 bits, small low-rank matrices are injected beside the attention projections, and only those are trained.</w:t>
       </w:r>
     </w:p>
     <w:p>
@@ -1199,7 +1226,7 @@
         <w:rPr>
           <w:i w:val="0"/>
         </w:rPr>
-        <w:t>The rank, alpha and learning rate follow the reference PEFT + Whisper recipe published by Hugging Face rather than being tuned independently. This is stated rather than presented as an original choice: with a single training run available, tuning them would have meant spending the run on a hyperparameter search instead of on the deliverable.</w:t>
+        <w:t>The rank, alpha and learning rate follow the reference PEFT + Whisper recipe published by Hugging Face rather than being tuned independently. This is stated rather than presented as an original choice: with a single training run available, tuning them would have meant spending that run on a hyperparameter search instead of on the deliverable.</w:t>
       </w:r>
     </w:p>
     <w:p>
@@ -1214,7 +1241,7 @@
         <w:t xml:space="preserve">use_cache = False — </w:t>
       </w:r>
       <w:r>
-        <w:t>required for gradient checkpointing, which is mandatory here on memory grounds</w:t>
+        <w:t>required for gradient checkpointing</w:t>
       </w:r>
     </w:p>
     <w:p>
@@ -1513,7 +1540,7 @@
                 <w:b w:val="0"/>
                 <w:sz w:val="18"/>
               </w:rPr>
-              <w:t>enabled</w:t>
+              <w:t>enabled (required — §9)</w:t>
             </w:r>
           </w:p>
         </w:tc>
@@ -1590,7 +1617,7 @@
                 <w:b w:val="0"/>
                 <w:sz w:val="18"/>
               </w:rPr>
-              <w:t>every 1,500 steps</w:t>
+              <w:t>1,500 steps</w:t>
             </w:r>
           </w:p>
         </w:tc>
@@ -1760,7 +1787,7 @@
         <w:rPr>
           <w:i w:val="0"/>
         </w:rPr>
-        <w:t>33,432 training samples at an effective batch of 16 give 2,090 optimizer steps per epoch and 6,270 over three epochs.</w:t>
+        <w:t>33,432 training samples at an effective batch of 16 give 2,090 optimizer steps per epoch and 6,270 over three epochs. The evaluation interval was passed on the command line as --eval_steps 1500; the value committed in src/config.py is 500, which would have produced 12 evaluations and roughly two additional hours of generation. The reasoning behind that trade is in section 6.</w:t>
       </w:r>
     </w:p>
     <w:p>
@@ -1804,7 +1831,21 @@
         <w:rPr>
           <w:b w:val="0"/>
         </w:rPr>
-        <w:t>predict_with_generate=True makes the model produce text autoregressively at evaluation time. This is why evaluation is slow — roughly 1.1 s per sample — and why loss and WER can move independently: loss is computed with the correct previous tokens supplied, WER is not. A model can therefore be improving on loss while its free-running output does not improve, which is exactly the distinction Task 3 examines.</w:t>
+        <w:t>predict_with_generate=True makes the model produce text autoregressively at evaluation time. This is why evaluation is expensive, and why loss and WER can move independently: loss is computed with the correct previous tokens supplied, WER is not. A model can therefore improve on loss while its free-running output does not — the distinction Task 3 examines.</w:t>
+      </w:r>
+    </w:p>
+    <w:p>
+      <w:r>
+        <w:rPr>
+          <w:b/>
+        </w:rPr>
+        <w:t xml:space="preserve">What that cost, measured. </w:t>
+      </w:r>
+      <w:r>
+        <w:rPr>
+          <w:b w:val="0"/>
+        </w:rPr>
+        <w:t>Each in-training evaluation took 586 seconds over a fixed 1,500-row subset; the final evaluation took 6,779 seconds over the full 5,900 rows, or 1.15 s per sample. The periodic evaluations were capped at that subset for exactly this reason, and the reported headline metrics come from the full-split run at the end. This is why the in-training figure at step 6,270 is 8.17% while the reported WER is 8.05%: different sample counts, not different models.</w:t>
       </w:r>
     </w:p>
     <w:p>
@@ -1822,6 +1863,862 @@
       </w:r>
     </w:p>
     <w:p>
+      <w:pPr>
+        <w:pStyle w:val="Heading2"/>
+      </w:pPr>
+      <w:r>
+        <w:t>Evaluation history</w:t>
+      </w:r>
+    </w:p>
+    <w:tbl>
+      <w:tblPr>
+        <w:tblStyle w:val="TableGrid"/>
+        <w:tblW w:type="auto" w:w="0"/>
+        <w:jc w:val="center"/>
+        <w:tblLook w:firstColumn="1" w:firstRow="1" w:lastColumn="0" w:lastRow="0" w:noHBand="0" w:noVBand="1" w:val="04A0"/>
+      </w:tblPr>
+      <w:tblGrid>
+        <w:gridCol w:w="1577"/>
+        <w:gridCol w:w="1577"/>
+        <w:gridCol w:w="1577"/>
+        <w:gridCol w:w="1577"/>
+        <w:gridCol w:w="1577"/>
+        <w:gridCol w:w="1577"/>
+      </w:tblGrid>
+      <w:tr>
+        <w:trPr>
+          <w:tblHeader w:val="true"/>
+        </w:trPr>
+        <w:tc>
+          <w:tcPr>
+            <w:tcW w:type="dxa" w:w="1872"/>
+            <w:shd w:val="clear" w:fill="DCE6F1"/>
+          </w:tcPr>
+          <w:p>
+            <w:pPr>
+              <w:spacing w:before="20" w:after="20"/>
+            </w:pPr>
+            <w:r/>
+            <w:r>
+              <w:rPr>
+                <w:b/>
+                <w:sz w:val="18"/>
+              </w:rPr>
+              <w:t>Step</w:t>
+            </w:r>
+          </w:p>
+        </w:tc>
+        <w:tc>
+          <w:tcPr>
+            <w:tcW w:type="dxa" w:w="1296"/>
+            <w:shd w:val="clear" w:fill="DCE6F1"/>
+          </w:tcPr>
+          <w:p>
+            <w:pPr>
+              <w:spacing w:before="20" w:after="20"/>
+            </w:pPr>
+            <w:r/>
+            <w:r>
+              <w:rPr>
+                <w:b/>
+                <w:sz w:val="18"/>
+              </w:rPr>
+              <w:t>Epoch</w:t>
+            </w:r>
+          </w:p>
+        </w:tc>
+        <w:tc>
+          <w:tcPr>
+            <w:tcW w:type="dxa" w:w="1584"/>
+            <w:shd w:val="clear" w:fill="DCE6F1"/>
+          </w:tcPr>
+          <w:p>
+            <w:pPr>
+              <w:spacing w:before="20" w:after="20"/>
+            </w:pPr>
+            <w:r/>
+            <w:r>
+              <w:rPr>
+                <w:b/>
+                <w:sz w:val="18"/>
+              </w:rPr>
+              <w:t>Val loss</w:t>
+            </w:r>
+          </w:p>
+        </w:tc>
+        <w:tc>
+          <w:tcPr>
+            <w:tcW w:type="dxa" w:w="1296"/>
+            <w:shd w:val="clear" w:fill="DCE6F1"/>
+          </w:tcPr>
+          <w:p>
+            <w:pPr>
+              <w:spacing w:before="20" w:after="20"/>
+            </w:pPr>
+            <w:r/>
+            <w:r>
+              <w:rPr>
+                <w:b/>
+                <w:sz w:val="18"/>
+              </w:rPr>
+              <w:t>WER %</w:t>
+            </w:r>
+          </w:p>
+        </w:tc>
+        <w:tc>
+          <w:tcPr>
+            <w:tcW w:type="dxa" w:w="1296"/>
+            <w:shd w:val="clear" w:fill="DCE6F1"/>
+          </w:tcPr>
+          <w:p>
+            <w:pPr>
+              <w:spacing w:before="20" w:after="20"/>
+            </w:pPr>
+            <w:r/>
+            <w:r>
+              <w:rPr>
+                <w:b/>
+                <w:sz w:val="18"/>
+              </w:rPr>
+              <w:t>CER %</w:t>
+            </w:r>
+          </w:p>
+        </w:tc>
+        <w:tc>
+          <w:tcPr>
+            <w:tcW w:type="dxa" w:w="2160"/>
+            <w:shd w:val="clear" w:fill="DCE6F1"/>
+          </w:tcPr>
+          <w:p>
+            <w:pPr>
+              <w:spacing w:before="20" w:after="20"/>
+            </w:pPr>
+            <w:r/>
+            <w:r>
+              <w:rPr>
+                <w:b/>
+                <w:sz w:val="18"/>
+              </w:rPr>
+              <w:t>Eval seconds</w:t>
+            </w:r>
+          </w:p>
+        </w:tc>
+      </w:tr>
+      <w:tr>
+        <w:trPr>
+          <w:cantSplit/>
+        </w:trPr>
+        <w:tc>
+          <w:tcPr>
+            <w:tcW w:type="dxa" w:w="1872"/>
+          </w:tcPr>
+          <w:p>
+            <w:pPr>
+              <w:spacing w:before="20" w:after="20"/>
+            </w:pPr>
+            <w:r/>
+            <w:r>
+              <w:rPr>
+                <w:b w:val="0"/>
+                <w:sz w:val="18"/>
+              </w:rPr>
+              <w:t>1,500</w:t>
+            </w:r>
+          </w:p>
+        </w:tc>
+        <w:tc>
+          <w:tcPr>
+            <w:tcW w:type="dxa" w:w="1296"/>
+          </w:tcPr>
+          <w:p>
+            <w:pPr>
+              <w:spacing w:before="20" w:after="20"/>
+              <w:jc w:val="right"/>
+            </w:pPr>
+            <w:r/>
+            <w:r>
+              <w:rPr>
+                <w:b w:val="0"/>
+                <w:sz w:val="18"/>
+              </w:rPr>
+              <w:t>0.72</w:t>
+            </w:r>
+          </w:p>
+        </w:tc>
+        <w:tc>
+          <w:tcPr>
+            <w:tcW w:type="dxa" w:w="1584"/>
+          </w:tcPr>
+          <w:p>
+            <w:pPr>
+              <w:spacing w:before="20" w:after="20"/>
+              <w:jc w:val="right"/>
+            </w:pPr>
+            <w:r/>
+            <w:r>
+              <w:rPr>
+                <w:b w:val="0"/>
+                <w:sz w:val="18"/>
+              </w:rPr>
+              <w:t>0.16152</w:t>
+            </w:r>
+          </w:p>
+        </w:tc>
+        <w:tc>
+          <w:tcPr>
+            <w:tcW w:type="dxa" w:w="1296"/>
+          </w:tcPr>
+          <w:p>
+            <w:pPr>
+              <w:spacing w:before="20" w:after="20"/>
+              <w:jc w:val="right"/>
+            </w:pPr>
+            <w:r/>
+            <w:r>
+              <w:rPr>
+                <w:b w:val="0"/>
+                <w:sz w:val="18"/>
+              </w:rPr>
+              <w:t>16.30</w:t>
+            </w:r>
+          </w:p>
+        </w:tc>
+        <w:tc>
+          <w:tcPr>
+            <w:tcW w:type="dxa" w:w="1296"/>
+          </w:tcPr>
+          <w:p>
+            <w:pPr>
+              <w:spacing w:before="20" w:after="20"/>
+              <w:jc w:val="right"/>
+            </w:pPr>
+            <w:r/>
+            <w:r>
+              <w:rPr>
+                <w:b w:val="0"/>
+                <w:sz w:val="18"/>
+              </w:rPr>
+              <w:t>4.77</w:t>
+            </w:r>
+          </w:p>
+        </w:tc>
+        <w:tc>
+          <w:tcPr>
+            <w:tcW w:type="dxa" w:w="2160"/>
+          </w:tcPr>
+          <w:p>
+            <w:pPr>
+              <w:spacing w:before="20" w:after="20"/>
+              <w:jc w:val="right"/>
+            </w:pPr>
+            <w:r/>
+            <w:r>
+              <w:rPr>
+                <w:b w:val="0"/>
+                <w:sz w:val="18"/>
+              </w:rPr>
+              <w:t>594.0</w:t>
+            </w:r>
+          </w:p>
+        </w:tc>
+      </w:tr>
+      <w:tr>
+        <w:trPr>
+          <w:cantSplit/>
+        </w:trPr>
+        <w:tc>
+          <w:tcPr>
+            <w:tcW w:type="dxa" w:w="1872"/>
+          </w:tcPr>
+          <w:p>
+            <w:pPr>
+              <w:spacing w:before="20" w:after="20"/>
+            </w:pPr>
+            <w:r/>
+            <w:r>
+              <w:rPr>
+                <w:b w:val="0"/>
+                <w:sz w:val="18"/>
+              </w:rPr>
+              <w:t>3,000</w:t>
+            </w:r>
+          </w:p>
+        </w:tc>
+        <w:tc>
+          <w:tcPr>
+            <w:tcW w:type="dxa" w:w="1296"/>
+          </w:tcPr>
+          <w:p>
+            <w:pPr>
+              <w:spacing w:before="20" w:after="20"/>
+              <w:jc w:val="right"/>
+            </w:pPr>
+            <w:r/>
+            <w:r>
+              <w:rPr>
+                <w:b w:val="0"/>
+                <w:sz w:val="18"/>
+              </w:rPr>
+              <w:t>1.44</w:t>
+            </w:r>
+          </w:p>
+        </w:tc>
+        <w:tc>
+          <w:tcPr>
+            <w:tcW w:type="dxa" w:w="1584"/>
+          </w:tcPr>
+          <w:p>
+            <w:pPr>
+              <w:spacing w:before="20" w:after="20"/>
+              <w:jc w:val="right"/>
+            </w:pPr>
+            <w:r/>
+            <w:r>
+              <w:rPr>
+                <w:b w:val="0"/>
+                <w:sz w:val="18"/>
+              </w:rPr>
+              <w:t>0.12877</w:t>
+            </w:r>
+          </w:p>
+        </w:tc>
+        <w:tc>
+          <w:tcPr>
+            <w:tcW w:type="dxa" w:w="1296"/>
+          </w:tcPr>
+          <w:p>
+            <w:pPr>
+              <w:spacing w:before="20" w:after="20"/>
+              <w:jc w:val="right"/>
+            </w:pPr>
+            <w:r/>
+            <w:r>
+              <w:rPr>
+                <w:b w:val="0"/>
+                <w:sz w:val="18"/>
+              </w:rPr>
+              <w:t>12.50</w:t>
+            </w:r>
+          </w:p>
+        </w:tc>
+        <w:tc>
+          <w:tcPr>
+            <w:tcW w:type="dxa" w:w="1296"/>
+          </w:tcPr>
+          <w:p>
+            <w:pPr>
+              <w:spacing w:before="20" w:after="20"/>
+              <w:jc w:val="right"/>
+            </w:pPr>
+            <w:r/>
+            <w:r>
+              <w:rPr>
+                <w:b w:val="0"/>
+                <w:sz w:val="18"/>
+              </w:rPr>
+              <w:t>3.12</w:t>
+            </w:r>
+          </w:p>
+        </w:tc>
+        <w:tc>
+          <w:tcPr>
+            <w:tcW w:type="dxa" w:w="2160"/>
+          </w:tcPr>
+          <w:p>
+            <w:pPr>
+              <w:spacing w:before="20" w:after="20"/>
+              <w:jc w:val="right"/>
+            </w:pPr>
+            <w:r/>
+            <w:r>
+              <w:rPr>
+                <w:b w:val="0"/>
+                <w:sz w:val="18"/>
+              </w:rPr>
+              <w:t>585.9</w:t>
+            </w:r>
+          </w:p>
+        </w:tc>
+      </w:tr>
+      <w:tr>
+        <w:trPr>
+          <w:cantSplit/>
+        </w:trPr>
+        <w:tc>
+          <w:tcPr>
+            <w:tcW w:type="dxa" w:w="1872"/>
+          </w:tcPr>
+          <w:p>
+            <w:pPr>
+              <w:spacing w:before="20" w:after="20"/>
+            </w:pPr>
+            <w:r/>
+            <w:r>
+              <w:rPr>
+                <w:b w:val="0"/>
+                <w:sz w:val="18"/>
+              </w:rPr>
+              <w:t>4,500</w:t>
+            </w:r>
+          </w:p>
+        </w:tc>
+        <w:tc>
+          <w:tcPr>
+            <w:tcW w:type="dxa" w:w="1296"/>
+          </w:tcPr>
+          <w:p>
+            <w:pPr>
+              <w:spacing w:before="20" w:after="20"/>
+              <w:jc w:val="right"/>
+            </w:pPr>
+            <w:r/>
+            <w:r>
+              <w:rPr>
+                <w:b w:val="0"/>
+                <w:sz w:val="18"/>
+              </w:rPr>
+              <w:t>2.15</w:t>
+            </w:r>
+          </w:p>
+        </w:tc>
+        <w:tc>
+          <w:tcPr>
+            <w:tcW w:type="dxa" w:w="1584"/>
+          </w:tcPr>
+          <w:p>
+            <w:pPr>
+              <w:spacing w:before="20" w:after="20"/>
+              <w:jc w:val="right"/>
+            </w:pPr>
+            <w:r/>
+            <w:r>
+              <w:rPr>
+                <w:b w:val="0"/>
+                <w:sz w:val="18"/>
+              </w:rPr>
+              <w:t>0.10067</w:t>
+            </w:r>
+          </w:p>
+        </w:tc>
+        <w:tc>
+          <w:tcPr>
+            <w:tcW w:type="dxa" w:w="1296"/>
+          </w:tcPr>
+          <w:p>
+            <w:pPr>
+              <w:spacing w:before="20" w:after="20"/>
+              <w:jc w:val="right"/>
+            </w:pPr>
+            <w:r/>
+            <w:r>
+              <w:rPr>
+                <w:b w:val="0"/>
+                <w:sz w:val="18"/>
+              </w:rPr>
+              <w:t>9.57</w:t>
+            </w:r>
+          </w:p>
+        </w:tc>
+        <w:tc>
+          <w:tcPr>
+            <w:tcW w:type="dxa" w:w="1296"/>
+          </w:tcPr>
+          <w:p>
+            <w:pPr>
+              <w:spacing w:before="20" w:after="20"/>
+              <w:jc w:val="right"/>
+            </w:pPr>
+            <w:r/>
+            <w:r>
+              <w:rPr>
+                <w:b w:val="0"/>
+                <w:sz w:val="18"/>
+              </w:rPr>
+              <w:t>2.28</w:t>
+            </w:r>
+          </w:p>
+        </w:tc>
+        <w:tc>
+          <w:tcPr>
+            <w:tcW w:type="dxa" w:w="2160"/>
+          </w:tcPr>
+          <w:p>
+            <w:pPr>
+              <w:spacing w:before="20" w:after="20"/>
+              <w:jc w:val="right"/>
+            </w:pPr>
+            <w:r/>
+            <w:r>
+              <w:rPr>
+                <w:b w:val="0"/>
+                <w:sz w:val="18"/>
+              </w:rPr>
+              <w:t>585.2</w:t>
+            </w:r>
+          </w:p>
+        </w:tc>
+      </w:tr>
+      <w:tr>
+        <w:trPr>
+          <w:cantSplit/>
+        </w:trPr>
+        <w:tc>
+          <w:tcPr>
+            <w:tcW w:type="dxa" w:w="1872"/>
+          </w:tcPr>
+          <w:p>
+            <w:pPr>
+              <w:spacing w:before="20" w:after="20"/>
+            </w:pPr>
+            <w:r/>
+            <w:r>
+              <w:rPr>
+                <w:b w:val="0"/>
+                <w:sz w:val="18"/>
+              </w:rPr>
+              <w:t>6,000</w:t>
+            </w:r>
+          </w:p>
+        </w:tc>
+        <w:tc>
+          <w:tcPr>
+            <w:tcW w:type="dxa" w:w="1296"/>
+          </w:tcPr>
+          <w:p>
+            <w:pPr>
+              <w:spacing w:before="20" w:after="20"/>
+              <w:jc w:val="right"/>
+            </w:pPr>
+            <w:r/>
+            <w:r>
+              <w:rPr>
+                <w:b w:val="0"/>
+                <w:sz w:val="18"/>
+              </w:rPr>
+              <w:t>2.87</w:t>
+            </w:r>
+          </w:p>
+        </w:tc>
+        <w:tc>
+          <w:tcPr>
+            <w:tcW w:type="dxa" w:w="1584"/>
+          </w:tcPr>
+          <w:p>
+            <w:pPr>
+              <w:spacing w:before="20" w:after="20"/>
+              <w:jc w:val="right"/>
+            </w:pPr>
+            <w:r/>
+            <w:r>
+              <w:rPr>
+                <w:b w:val="0"/>
+                <w:sz w:val="18"/>
+              </w:rPr>
+              <w:t>0.08704</w:t>
+            </w:r>
+          </w:p>
+        </w:tc>
+        <w:tc>
+          <w:tcPr>
+            <w:tcW w:type="dxa" w:w="1296"/>
+          </w:tcPr>
+          <w:p>
+            <w:pPr>
+              <w:spacing w:before="20" w:after="20"/>
+              <w:jc w:val="right"/>
+            </w:pPr>
+            <w:r/>
+            <w:r>
+              <w:rPr>
+                <w:b w:val="0"/>
+                <w:sz w:val="18"/>
+              </w:rPr>
+              <w:t>8.19</w:t>
+            </w:r>
+          </w:p>
+        </w:tc>
+        <w:tc>
+          <w:tcPr>
+            <w:tcW w:type="dxa" w:w="1296"/>
+          </w:tcPr>
+          <w:p>
+            <w:pPr>
+              <w:spacing w:before="20" w:after="20"/>
+              <w:jc w:val="right"/>
+            </w:pPr>
+            <w:r/>
+            <w:r>
+              <w:rPr>
+                <w:b w:val="0"/>
+                <w:sz w:val="18"/>
+              </w:rPr>
+              <w:t>1.94</w:t>
+            </w:r>
+          </w:p>
+        </w:tc>
+        <w:tc>
+          <w:tcPr>
+            <w:tcW w:type="dxa" w:w="2160"/>
+          </w:tcPr>
+          <w:p>
+            <w:pPr>
+              <w:spacing w:before="20" w:after="20"/>
+              <w:jc w:val="right"/>
+            </w:pPr>
+            <w:r/>
+            <w:r>
+              <w:rPr>
+                <w:b w:val="0"/>
+                <w:sz w:val="18"/>
+              </w:rPr>
+              <w:t>586.5</w:t>
+            </w:r>
+          </w:p>
+        </w:tc>
+      </w:tr>
+      <w:tr>
+        <w:trPr>
+          <w:cantSplit/>
+        </w:trPr>
+        <w:tc>
+          <w:tcPr>
+            <w:tcW w:type="dxa" w:w="1872"/>
+          </w:tcPr>
+          <w:p>
+            <w:pPr>
+              <w:spacing w:before="20" w:after="20"/>
+            </w:pPr>
+            <w:r/>
+            <w:r>
+              <w:rPr>
+                <w:b w:val="0"/>
+                <w:sz w:val="18"/>
+              </w:rPr>
+              <w:t>6,270</w:t>
+            </w:r>
+          </w:p>
+        </w:tc>
+        <w:tc>
+          <w:tcPr>
+            <w:tcW w:type="dxa" w:w="1296"/>
+          </w:tcPr>
+          <w:p>
+            <w:pPr>
+              <w:spacing w:before="20" w:after="20"/>
+              <w:jc w:val="right"/>
+            </w:pPr>
+            <w:r/>
+            <w:r>
+              <w:rPr>
+                <w:b w:val="0"/>
+                <w:sz w:val="18"/>
+              </w:rPr>
+              <w:t>3.00</w:t>
+            </w:r>
+          </w:p>
+        </w:tc>
+        <w:tc>
+          <w:tcPr>
+            <w:tcW w:type="dxa" w:w="1584"/>
+          </w:tcPr>
+          <w:p>
+            <w:pPr>
+              <w:spacing w:before="20" w:after="20"/>
+              <w:jc w:val="right"/>
+            </w:pPr>
+            <w:r/>
+            <w:r>
+              <w:rPr>
+                <w:b w:val="0"/>
+                <w:sz w:val="18"/>
+              </w:rPr>
+              <w:t>0.08567</w:t>
+            </w:r>
+          </w:p>
+        </w:tc>
+        <w:tc>
+          <w:tcPr>
+            <w:tcW w:type="dxa" w:w="1296"/>
+          </w:tcPr>
+          <w:p>
+            <w:pPr>
+              <w:spacing w:before="20" w:after="20"/>
+              <w:jc w:val="right"/>
+            </w:pPr>
+            <w:r/>
+            <w:r>
+              <w:rPr>
+                <w:b w:val="0"/>
+                <w:sz w:val="18"/>
+              </w:rPr>
+              <w:t>8.17</w:t>
+            </w:r>
+          </w:p>
+        </w:tc>
+        <w:tc>
+          <w:tcPr>
+            <w:tcW w:type="dxa" w:w="1296"/>
+          </w:tcPr>
+          <w:p>
+            <w:pPr>
+              <w:spacing w:before="20" w:after="20"/>
+              <w:jc w:val="right"/>
+            </w:pPr>
+            <w:r/>
+            <w:r>
+              <w:rPr>
+                <w:b w:val="0"/>
+                <w:sz w:val="18"/>
+              </w:rPr>
+              <w:t>1.90</w:t>
+            </w:r>
+          </w:p>
+        </w:tc>
+        <w:tc>
+          <w:tcPr>
+            <w:tcW w:type="dxa" w:w="2160"/>
+          </w:tcPr>
+          <w:p>
+            <w:pPr>
+              <w:spacing w:before="20" w:after="20"/>
+              <w:jc w:val="right"/>
+            </w:pPr>
+            <w:r/>
+            <w:r>
+              <w:rPr>
+                <w:b w:val="0"/>
+                <w:sz w:val="18"/>
+              </w:rPr>
+              <w:t>584.9</w:t>
+            </w:r>
+          </w:p>
+        </w:tc>
+      </w:tr>
+      <w:tr>
+        <w:trPr>
+          <w:cantSplit/>
+        </w:trPr>
+        <w:tc>
+          <w:tcPr>
+            <w:tcW w:type="dxa" w:w="1872"/>
+          </w:tcPr>
+          <w:p>
+            <w:pPr>
+              <w:spacing w:before="20" w:after="20"/>
+            </w:pPr>
+            <w:r/>
+            <w:r>
+              <w:rPr>
+                <w:b/>
+                <w:sz w:val="18"/>
+              </w:rPr>
+              <w:t>final, full split</w:t>
+            </w:r>
+          </w:p>
+        </w:tc>
+        <w:tc>
+          <w:tcPr>
+            <w:tcW w:type="dxa" w:w="1296"/>
+          </w:tcPr>
+          <w:p>
+            <w:pPr>
+              <w:spacing w:before="20" w:after="20"/>
+              <w:jc w:val="right"/>
+            </w:pPr>
+            <w:r/>
+            <w:r>
+              <w:rPr>
+                <w:b/>
+                <w:sz w:val="18"/>
+              </w:rPr>
+              <w:t>3.00</w:t>
+            </w:r>
+          </w:p>
+        </w:tc>
+        <w:tc>
+          <w:tcPr>
+            <w:tcW w:type="dxa" w:w="1584"/>
+          </w:tcPr>
+          <w:p>
+            <w:pPr>
+              <w:spacing w:before="20" w:after="20"/>
+              <w:jc w:val="right"/>
+            </w:pPr>
+            <w:r/>
+            <w:r>
+              <w:rPr>
+                <w:b/>
+                <w:sz w:val="18"/>
+              </w:rPr>
+              <w:t>0.08627</w:t>
+            </w:r>
+          </w:p>
+        </w:tc>
+        <w:tc>
+          <w:tcPr>
+            <w:tcW w:type="dxa" w:w="1296"/>
+          </w:tcPr>
+          <w:p>
+            <w:pPr>
+              <w:spacing w:before="20" w:after="20"/>
+              <w:jc w:val="right"/>
+            </w:pPr>
+            <w:r/>
+            <w:r>
+              <w:rPr>
+                <w:b/>
+                <w:sz w:val="18"/>
+              </w:rPr>
+              <w:t>8.05</w:t>
+            </w:r>
+          </w:p>
+        </w:tc>
+        <w:tc>
+          <w:tcPr>
+            <w:tcW w:type="dxa" w:w="1296"/>
+          </w:tcPr>
+          <w:p>
+            <w:pPr>
+              <w:spacing w:before="20" w:after="20"/>
+              <w:jc w:val="right"/>
+            </w:pPr>
+            <w:r/>
+            <w:r>
+              <w:rPr>
+                <w:b/>
+                <w:sz w:val="18"/>
+              </w:rPr>
+              <w:t>2.00</w:t>
+            </w:r>
+          </w:p>
+        </w:tc>
+        <w:tc>
+          <w:tcPr>
+            <w:tcW w:type="dxa" w:w="2160"/>
+          </w:tcPr>
+          <w:p>
+            <w:pPr>
+              <w:spacing w:before="20" w:after="20"/>
+              <w:jc w:val="right"/>
+            </w:pPr>
+            <w:r/>
+            <w:r>
+              <w:rPr>
+                <w:b/>
+                <w:sz w:val="18"/>
+              </w:rPr>
+              <w:t>6,779</w:t>
+            </w:r>
+          </w:p>
+        </w:tc>
+      </w:tr>
+    </w:tbl>
+    <w:p>
+      <w:pPr>
+        <w:spacing w:after="20"/>
+      </w:pPr>
+    </w:p>
+    <w:p>
       <w:r>
         <w:rPr>
           <w:b/>
@@ -1832,7 +2729,7 @@
         <w:rPr>
           <w:b w:val="0"/>
         </w:rPr>
-        <w:t>load_best_model_at_end=True with metric_for_best_model="wer" and greater_is_better=False. Checkpoints are written every 1,500 steps, save_total_limit=2, and the lowest-WER checkpoint is reloaded and saved at the end. In this run WER improved monotonically, so the best checkpoint was the last one — step 6,270 at 8.17% on the evaluation subset. The mechanism was still worth having: had the model started overfitting in epoch 3, the submitted weights would not have been the final ones.</w:t>
+        <w:t>load_best_model_at_end=True with metric_for_best_model="wer", greater_is_better=False and save_total_limit=2. WER improved monotonically, so the best checkpoint was the last one — trainer_state.json records best_model_checkpoint = checkpoint-6270 at 8.17. The mechanism still earned its place: had the model begun overfitting during epoch 3, the submitted weights would not have been the final ones.</w:t>
       </w:r>
     </w:p>
     <w:p>
@@ -1851,7 +2748,7 @@
         <w:rPr>
           <w:i w:val="0"/>
         </w:rPr>
-        <w:t>Each of these ran to completion, logged nothing unusual, and produced a loss curve that looked entirely reasonable. They are described because finding them is the part of this task that took the most effort, and because the pattern they share informed the rest of the design.</w:t>
+        <w:t>Each of these ran to completion, logged nothing unusual, and produced a loss curve that looked entirely reasonable.</w:t>
       </w:r>
     </w:p>
     <w:tbl>
@@ -1964,7 +2861,7 @@
                 <w:b w:val="0"/>
                 <w:sz w:val="17"/>
               </w:rPr>
-              <w:t>The collator compared against bos_token_id (50257) but Whisper labels start with decoder_start_token_id (50258), so the condition never matched and the decoder received the prefix twice</w:t>
+              <w:t>the collator compared against bos_token_id (50257) but Whisper labels start with decoder_start_token_id (50258), so the condition never matched and the decoder received the prefix twice</w:t>
             </w:r>
           </w:p>
         </w:tc>
@@ -2181,7 +3078,7 @@
         <w:rPr>
           <w:b w:val="0"/>
         </w:rPr>
-        <w:t>Every one of these was a fallback path that made a reasonable-looking guess instead of stopping. The design rule adopted afterwards is that the pipeline should fail loudly rather than proceed on an assumption: an unrecognised audio type raises, a missing cleaned transcript raises, a decode failure rate above 0.5% aborts the run, and an id appearing in both splits aborts before any GPU time is spent. A crash costs minutes; a silent substitution costs the entire run and is only discovered by reading the output.</w:t>
+        <w:t>Every one was a fallback path that made a reasonable-looking guess instead of stopping. The rule adopted afterwards is that the pipeline fails loudly rather than proceeding on an assumption: an unrecognised audio type raises, a missing cleaned transcript raises, a decode failure rate above 0.5% aborts, and an id in both splits aborts before any GPU time is spent. A crash costs minutes; a silent substitution costs the whole run and is only discovered by reading the output.</w:t>
       </w:r>
     </w:p>
     <w:p>
@@ -2465,7 +3362,7 @@
         <w:rPr>
           <w:i w:val="0"/>
         </w:rPr>
-        <w:t>benchmark=False is the one that costs something: it stops cuDNN choosing the fastest kernel per run, which is a small throughput loss in exchange for run-to-run reproducibility.</w:t>
+        <w:t>benchmark=False is the one that costs something: it stops cuDNN choosing the fastest kernel per run, a small throughput loss in exchange for run-to-run reproducibility.</w:t>
       </w:r>
     </w:p>
     <w:tbl>
@@ -2558,7 +3455,7 @@
                 <w:b w:val="0"/>
                 <w:sz w:val="18"/>
               </w:rPr>
-              <w:t>50 checks before any GPU time is spent — configuration, code invariants and a data probe</w:t>
+              <w:t>50 checks before any GPU time is spent — 42 over the source, 8 over the Task 1 output</w:t>
             </w:r>
           </w:p>
         </w:tc>
@@ -2599,7 +3496,48 @@
                 <w:b w:val="0"/>
                 <w:sz w:val="18"/>
               </w:rPr>
-              <w:t>independently reproduces every Task 1 statistic from the raw parquet shards</w:t>
+              <w:t>reproduces every Task 1 statistic from the raw parquet shards</w:t>
+            </w:r>
+          </w:p>
+        </w:tc>
+      </w:tr>
+      <w:tr>
+        <w:trPr>
+          <w:cantSplit/>
+        </w:trPr>
+        <w:tc>
+          <w:tcPr>
+            <w:tcW w:type="dxa" w:w="2304"/>
+          </w:tcPr>
+          <w:p>
+            <w:pPr>
+              <w:spacing w:before="20" w:after="20"/>
+            </w:pPr>
+            <w:r/>
+            <w:r>
+              <w:rPr>
+                <w:b w:val="0"/>
+                <w:sz w:val="18"/>
+              </w:rPr>
+              <w:t>collect_run_facts.py</w:t>
+            </w:r>
+          </w:p>
+        </w:tc>
+        <w:tc>
+          <w:tcPr>
+            <w:tcW w:type="dxa" w:w="7200"/>
+          </w:tcPr>
+          <w:p>
+            <w:pPr>
+              <w:spacing w:before="20" w:after="20"/>
+            </w:pPr>
+            <w:r/>
+            <w:r>
+              <w:rPr>
+                <w:b w:val="0"/>
+                <w:sz w:val="18"/>
+              </w:rPr>
+              <w:t>re-reads every measured figure in this document from the published training artefacts</w:t>
             </w:r>
           </w:p>
         </w:tc>
@@ -2654,6 +3592,14 @@
     <w:p>
       <w:r>
         <w:rPr>
+          <w:i w:val="0"/>
+        </w:rPr>
+        <w:t>The 42 source checks are not generic linting: each guards a specific defect that had previously failed silently — that the SOT comparison uses the right token, that the join uses the id key, that no path substitutes a zero waveform, that labels come from cleaned_text with no fallback. The 8 data checks re-assert the Task 1 output: row counts, unique ids, no id shared between splits, no Arabic characters or raw digits in labels.</w:t>
+      </w:r>
+    </w:p>
+    <w:p>
+      <w:r>
+        <w:rPr>
           <w:b/>
         </w:rPr>
         <w:t xml:space="preserve">How the checks were themselves checked. </w:t>
@@ -2662,7 +3608,7 @@
         <w:rPr>
           <w:b w:val="0"/>
         </w:rPr>
-        <w:t>Each defect from section 7 was deliberately reintroduced to confirm the corresponding check fails. This caught two checks that were passing vacuously: the comment-stripper used by the source-inspection checks joined tokens with spaces, which broke the attribute references it was searching for, so those checks were reporting success against text they could no longer match. A test that has never been seen to fail has not been shown to work.</w:t>
+        <w:t>Each defect from section 7 was deliberately reintroduced to confirm the corresponding check fails. That caught two checks passing vacuously: the comment-stripper used by the source-inspection checks joined tokens with spaces, breaking the attribute references it was searching for, so those checks were reporting success against text they could no longer match. A test that has never been seen to fail has not been shown to work.</w:t>
       </w:r>
     </w:p>
     <w:p>
@@ -2692,7 +3638,7 @@
         </w:trPr>
         <w:tc>
           <w:tcPr>
-            <w:tcW w:type="dxa" w:w="2160"/>
+            <w:tcW w:type="dxa" w:w="2016"/>
             <w:shd w:val="clear" w:fill="DCE6F1"/>
           </w:tcPr>
           <w:p>
@@ -2711,7 +3657,7 @@
         </w:tc>
         <w:tc>
           <w:tcPr>
-            <w:tcW w:type="dxa" w:w="2304"/>
+            <w:tcW w:type="dxa" w:w="2160"/>
             <w:shd w:val="clear" w:fill="DCE6F1"/>
           </w:tcPr>
           <w:p>
@@ -2730,7 +3676,7 @@
         </w:tc>
         <w:tc>
           <w:tcPr>
-            <w:tcW w:type="dxa" w:w="2448"/>
+            <w:tcW w:type="dxa" w:w="2592"/>
             <w:shd w:val="clear" w:fill="DCE6F1"/>
           </w:tcPr>
           <w:p>
@@ -2773,6 +3719,24 @@
         </w:trPr>
         <w:tc>
           <w:tcPr>
+            <w:tcW w:type="dxa" w:w="2016"/>
+          </w:tcPr>
+          <w:p>
+            <w:pPr>
+              <w:spacing w:before="20" w:after="20"/>
+            </w:pPr>
+            <w:r/>
+            <w:r>
+              <w:rPr>
+                <w:b w:val="0"/>
+                <w:sz w:val="18"/>
+              </w:rPr>
+              <w:t>WER / CER</w:t>
+            </w:r>
+          </w:p>
+        </w:tc>
+        <w:tc>
+          <w:tcPr>
             <w:tcW w:type="dxa" w:w="2160"/>
           </w:tcPr>
           <w:p>
@@ -2785,31 +3749,13 @@
                 <w:b w:val="0"/>
                 <w:sz w:val="18"/>
               </w:rPr>
-              <w:t>WER</w:t>
+              <w:t>8.05% / 2.00%</w:t>
             </w:r>
           </w:p>
         </w:tc>
         <w:tc>
           <w:tcPr>
-            <w:tcW w:type="dxa" w:w="2304"/>
-          </w:tcPr>
-          <w:p>
-            <w:pPr>
-              <w:spacing w:before="20" w:after="20"/>
-            </w:pPr>
-            <w:r/>
-            <w:r>
-              <w:rPr>
-                <w:b w:val="0"/>
-                <w:sz w:val="18"/>
-              </w:rPr>
-              <w:t>8.05%</w:t>
-            </w:r>
-          </w:p>
-        </w:tc>
-        <w:tc>
-          <w:tcPr>
-            <w:tcW w:type="dxa" w:w="2448"/>
+            <w:tcW w:type="dxa" w:w="2592"/>
           </w:tcPr>
           <w:p>
             <w:pPr>
@@ -2839,7 +3785,7 @@
                 <w:b w:val="0"/>
                 <w:sz w:val="18"/>
               </w:rPr>
-              <w:t>1× NVIDIA L4, 24 GB</w:t>
+              <w:t>1× NVIDIA L4, 22.03 GiB</w:t>
             </w:r>
           </w:p>
         </w:tc>
@@ -2848,6 +3794,24 @@
         <w:trPr>
           <w:cantSplit/>
         </w:trPr>
+        <w:tc>
+          <w:tcPr>
+            <w:tcW w:type="dxa" w:w="2016"/>
+          </w:tcPr>
+          <w:p>
+            <w:pPr>
+              <w:spacing w:before="20" w:after="20"/>
+            </w:pPr>
+            <w:r/>
+            <w:r>
+              <w:rPr>
+                <w:b w:val="0"/>
+                <w:sz w:val="18"/>
+              </w:rPr>
+              <w:t>Validation loss</w:t>
+            </w:r>
+          </w:p>
+        </w:tc>
         <w:tc>
           <w:tcPr>
             <w:tcW w:type="dxa" w:w="2160"/>
@@ -2862,31 +3826,13 @@
                 <w:b w:val="0"/>
                 <w:sz w:val="18"/>
               </w:rPr>
-              <w:t>CER</w:t>
+              <w:t>0.08627</w:t>
             </w:r>
           </w:p>
         </w:tc>
         <w:tc>
           <w:tcPr>
-            <w:tcW w:type="dxa" w:w="2304"/>
-          </w:tcPr>
-          <w:p>
-            <w:pPr>
-              <w:spacing w:before="20" w:after="20"/>
-            </w:pPr>
-            <w:r/>
-            <w:r>
-              <w:rPr>
-                <w:b w:val="0"/>
-                <w:sz w:val="18"/>
-              </w:rPr>
-              <w:t>2.00%</w:t>
-            </w:r>
-          </w:p>
-        </w:tc>
-        <w:tc>
-          <w:tcPr>
-            <w:tcW w:type="dxa" w:w="2448"/>
+            <w:tcW w:type="dxa" w:w="2592"/>
           </w:tcPr>
           <w:p>
             <w:pPr>
@@ -2916,7 +3862,7 @@
                 <w:b w:val="0"/>
                 <w:sz w:val="18"/>
               </w:rPr>
-              <w:t>5.51 GiB of 22.03 (25%)</w:t>
+              <w:t>5.51 GiB  (25%)</w:t>
             </w:r>
           </w:p>
         </w:tc>
@@ -2925,6 +3871,24 @@
         <w:trPr>
           <w:cantSplit/>
         </w:trPr>
+        <w:tc>
+          <w:tcPr>
+            <w:tcW w:type="dxa" w:w="2016"/>
+          </w:tcPr>
+          <w:p>
+            <w:pPr>
+              <w:spacing w:before="20" w:after="20"/>
+            </w:pPr>
+            <w:r/>
+            <w:r>
+              <w:rPr>
+                <w:b w:val="0"/>
+                <w:sz w:val="18"/>
+              </w:rPr>
+              <w:t>Evaluated on</w:t>
+            </w:r>
+          </w:p>
+        </w:tc>
         <w:tc>
           <w:tcPr>
             <w:tcW w:type="dxa" w:w="2160"/>
@@ -2939,13 +3903,13 @@
                 <w:b w:val="0"/>
                 <w:sz w:val="18"/>
               </w:rPr>
-              <w:t>Validation loss</w:t>
+              <w:t>full 5,900 split</w:t>
             </w:r>
           </w:p>
         </w:tc>
         <w:tc>
           <w:tcPr>
-            <w:tcW w:type="dxa" w:w="2304"/>
+            <w:tcW w:type="dxa" w:w="2592"/>
           </w:tcPr>
           <w:p>
             <w:pPr>
@@ -2957,25 +3921,7 @@
                 <w:b w:val="0"/>
                 <w:sz w:val="18"/>
               </w:rPr>
-              <w:t>0.0863</w:t>
-            </w:r>
-          </w:p>
-        </w:tc>
-        <w:tc>
-          <w:tcPr>
-            <w:tcW w:type="dxa" w:w="2448"/>
-          </w:tcPr>
-          <w:p>
-            <w:pPr>
-              <w:spacing w:before="20" w:after="20"/>
-            </w:pPr>
-            <w:r/>
-            <w:r>
-              <w:rPr>
-                <w:b w:val="0"/>
-                <w:sz w:val="18"/>
-              </w:rPr>
-              <w:t>Training time</w:t>
+              <w:t>Pure training</w:t>
             </w:r>
           </w:p>
         </w:tc>
@@ -2993,7 +3939,7 @@
                 <w:b w:val="0"/>
                 <w:sz w:val="18"/>
               </w:rPr>
-              <w:t>14 h 19 min</w:t>
+              <w:t>13 h 30 min</w:t>
             </w:r>
           </w:p>
         </w:tc>
@@ -3002,6 +3948,24 @@
         <w:trPr>
           <w:cantSplit/>
         </w:trPr>
+        <w:tc>
+          <w:tcPr>
+            <w:tcW w:type="dxa" w:w="2016"/>
+          </w:tcPr>
+          <w:p>
+            <w:pPr>
+              <w:spacing w:before="20" w:after="20"/>
+            </w:pPr>
+            <w:r/>
+            <w:r>
+              <w:rPr>
+                <w:b w:val="0"/>
+                <w:sz w:val="18"/>
+              </w:rPr>
+              <w:t>Optimizer steps</w:t>
+            </w:r>
+          </w:p>
+        </w:tc>
         <w:tc>
           <w:tcPr>
             <w:tcW w:type="dxa" w:w="2160"/>
@@ -3016,13 +3980,13 @@
                 <w:b w:val="0"/>
                 <w:sz w:val="18"/>
               </w:rPr>
-              <w:t>Evaluated on</w:t>
+              <w:t>6,270</w:t>
             </w:r>
           </w:p>
         </w:tc>
         <w:tc>
           <w:tcPr>
-            <w:tcW w:type="dxa" w:w="2304"/>
+            <w:tcW w:type="dxa" w:w="2592"/>
           </w:tcPr>
           <w:p>
             <w:pPr>
@@ -3034,13 +3998,13 @@
                 <w:b w:val="0"/>
                 <w:sz w:val="18"/>
               </w:rPr>
-              <w:t>full 5,900 split</w:t>
+              <w:t>In-training evaluation</w:t>
             </w:r>
           </w:p>
         </w:tc>
         <w:tc>
           <w:tcPr>
-            <w:tcW w:type="dxa" w:w="2448"/>
+            <w:tcW w:type="dxa" w:w="2736"/>
           </w:tcPr>
           <w:p>
             <w:pPr>
@@ -3052,7 +4016,66 @@
                 <w:b w:val="0"/>
                 <w:sz w:val="18"/>
               </w:rPr>
-              <w:t>Final evaluation</w:t>
+              <w:t>49 min  (5 runs)</w:t>
+            </w:r>
+          </w:p>
+        </w:tc>
+      </w:tr>
+      <w:tr>
+        <w:trPr>
+          <w:cantSplit/>
+        </w:trPr>
+        <w:tc>
+          <w:tcPr>
+            <w:tcW w:type="dxa" w:w="2016"/>
+          </w:tcPr>
+          <w:p>
+            <w:pPr>
+              <w:spacing w:before="20" w:after="20"/>
+            </w:pPr>
+            <w:r/>
+            <w:r>
+              <w:rPr>
+                <w:b w:val="0"/>
+                <w:sz w:val="18"/>
+              </w:rPr>
+              <w:t>Total FLOPs</w:t>
+            </w:r>
+          </w:p>
+        </w:tc>
+        <w:tc>
+          <w:tcPr>
+            <w:tcW w:type="dxa" w:w="2160"/>
+          </w:tcPr>
+          <w:p>
+            <w:pPr>
+              <w:spacing w:before="20" w:after="20"/>
+            </w:pPr>
+            <w:r/>
+            <w:r>
+              <w:rPr>
+                <w:b w:val="0"/>
+                <w:sz w:val="18"/>
+              </w:rPr>
+              <w:t>3.44e+20</w:t>
+            </w:r>
+          </w:p>
+        </w:tc>
+        <w:tc>
+          <w:tcPr>
+            <w:tcW w:type="dxa" w:w="2592"/>
+          </w:tcPr>
+          <w:p>
+            <w:pPr>
+              <w:spacing w:before="20" w:after="20"/>
+            </w:pPr>
+            <w:r/>
+            <w:r>
+              <w:rPr>
+                <w:b w:val="0"/>
+                <w:sz w:val="18"/>
+              </w:rPr>
+              <w:t>Final full evaluation</w:t>
             </w:r>
           </w:p>
         </w:tc>
@@ -3075,83 +4098,6 @@
           </w:p>
         </w:tc>
       </w:tr>
-      <w:tr>
-        <w:trPr>
-          <w:cantSplit/>
-        </w:trPr>
-        <w:tc>
-          <w:tcPr>
-            <w:tcW w:type="dxa" w:w="2160"/>
-          </w:tcPr>
-          <w:p>
-            <w:pPr>
-              <w:spacing w:before="20" w:after="20"/>
-            </w:pPr>
-            <w:r/>
-            <w:r>
-              <w:rPr>
-                <w:b w:val="0"/>
-                <w:sz w:val="18"/>
-              </w:rPr>
-              <w:t>Optimizer steps</w:t>
-            </w:r>
-          </w:p>
-        </w:tc>
-        <w:tc>
-          <w:tcPr>
-            <w:tcW w:type="dxa" w:w="2304"/>
-          </w:tcPr>
-          <w:p>
-            <w:pPr>
-              <w:spacing w:before="20" w:after="20"/>
-            </w:pPr>
-            <w:r/>
-            <w:r>
-              <w:rPr>
-                <w:b w:val="0"/>
-                <w:sz w:val="18"/>
-              </w:rPr>
-              <w:t>6,270</w:t>
-            </w:r>
-          </w:p>
-        </w:tc>
-        <w:tc>
-          <w:tcPr>
-            <w:tcW w:type="dxa" w:w="2448"/>
-          </w:tcPr>
-          <w:p>
-            <w:pPr>
-              <w:spacing w:before="20" w:after="20"/>
-            </w:pPr>
-            <w:r/>
-            <w:r>
-              <w:rPr>
-                <w:b w:val="0"/>
-                <w:sz w:val="18"/>
-              </w:rPr>
-              <w:t>Throughput</w:t>
-            </w:r>
-          </w:p>
-        </w:tc>
-        <w:tc>
-          <w:tcPr>
-            <w:tcW w:type="dxa" w:w="2736"/>
-          </w:tcPr>
-          <w:p>
-            <w:pPr>
-              <w:spacing w:before="20" w:after="20"/>
-            </w:pPr>
-            <w:r/>
-            <w:r>
-              <w:rPr>
-                <w:b w:val="0"/>
-                <w:sz w:val="18"/>
-              </w:rPr>
-              <w:t>7.7 s per optimizer step</w:t>
-            </w:r>
-          </w:p>
-        </w:tc>
-      </w:tr>
     </w:tbl>
     <w:p>
       <w:pPr>
@@ -3159,74 +4105,45 @@
       </w:pPr>
     </w:p>
     <w:p>
-      <w:pPr>
-        <w:spacing w:after="80"/>
-      </w:pPr>
-      <w:r>
-        <w:rPr>
-          <w:i w:val="0"/>
-        </w:rPr>
-        <w:t>Three measurements were made rather than assumed, using short controlled runs:</w:t>
-      </w:r>
-    </w:p>
-    <w:p>
-      <w:pPr>
-        <w:pStyle w:val="ListBullet"/>
-        <w:spacing w:after="40"/>
-      </w:pPr>
       <w:r>
         <w:rPr>
           <w:b/>
         </w:rPr>
-        <w:t xml:space="preserve">Hardware. </w:t>
+        <w:t xml:space="preserve">On the training time. </w:t>
       </w:r>
       <w:r>
-        <w:t>2.11× faster on the L4 than on a T4.</w:t>
+        <w:rPr>
+          <w:b w:val="0"/>
+        </w:rPr>
+        <w:t>Three different numbers describe this run and they are worth separating. Pure computation was 13 h 30 min, or 7.75 s per optimizer step. The Trainer reports train_runtime = 51,520 s (14 h 19 min), because the five in-training evaluations happen inside trainer.train(). Adding the final full-split evaluation gives 16 h 12 min end to end. Quoting the middle number as "training time" without saying what it contains is the kind of small imprecision that invites a question, so all three are given.</w:t>
       </w:r>
     </w:p>
     <w:p>
-      <w:pPr>
-        <w:pStyle w:val="ListBullet"/>
-        <w:spacing w:after="40"/>
-      </w:pPr>
       <w:r>
         <w:rPr>
           <w:b/>
         </w:rPr>
-        <w:t xml:space="preserve">Quantisation. </w:t>
+        <w:t xml:space="preserve">On memory. </w:t>
       </w:r>
       <w:r>
-        <w:t>fp32 training is 1.16× faster than 4-bit, because training is compute-bound and dropping the dequantisation step helps. Evaluation reverses this: 4-bit is 1.23× slower, because autoregressive generation is memory-bandwidth-bound. The two phases have opposite bottlenecks, which is not obvious from the configuration alone.</w:t>
+        <w:rPr>
+          <w:b w:val="0"/>
+        </w:rPr>
+        <w:t>Gradient checkpointing is a requirement on this hardware, not a tuning knob. This was measured: two ablation runs with --no_gradient_checkpointing both died with CUDA out of memory against the card's 22.03 GiB. With it enabled the real run peaked at 5.51 GiB, using a quarter of the card — so the memory headroom in the shipped configuration is entirely a product of checkpointing, not of the model being small.</w:t>
       </w:r>
     </w:p>
     <w:p>
-      <w:pPr>
-        <w:pStyle w:val="ListBullet"/>
-        <w:spacing w:after="40"/>
-      </w:pPr>
       <w:r>
         <w:rPr>
           <w:b/>
         </w:rPr>
-        <w:t xml:space="preserve">Memory. </w:t>
+        <w:t xml:space="preserve">A structural inefficiency. </w:t>
       </w:r>
       <w:r>
-        <w:t>Gradient checkpointing is not optional on this hardware. Without it the run does not fit in 22 GiB. With it, peak usage is 5.51 GiB.</w:t>
-      </w:r>
-    </w:p>
-    <w:p>
-      <w:pPr>
-        <w:pStyle w:val="ListBullet"/>
-        <w:spacing w:after="140"/>
-      </w:pPr>
-      <w:r>
         <w:rPr>
-          <w:b/>
+          <w:b w:val="0"/>
         </w:rPr>
-        <w:t xml:space="preserve">Structural. </w:t>
-      </w:r>
-      <w:r>
-        <w:t>Whisper pads every clip to 30 seconds while the corpus averages 5.69, so 81% of encoder computation is spent on padding. This is a property of the architecture, not of the data, and length-bucketing cannot help because every sample costs the same regardless of its true duration.</w:t>
+        <w:t>Whisper pads every clip to 30 seconds while the corpus averages 5.69, so 81% of encoder computation is spent on padding. This is a property of the architecture rather than of the data, and length-bucketing cannot help, because every sample costs the same regardless of its true duration.</w:t>
       </w:r>
     </w:p>
     <w:p>
@@ -3279,7 +4196,7 @@
         <w:t xml:space="preserve">In-domain validation. </w:t>
       </w:r>
       <w:r>
-        <w:t>Validation is drawn from the same corpus and recording conditions as training, so it measures in-domain accuracy rather than generalisation to new speakers or new recording environments.</w:t>
+        <w:t>Validation is drawn from the same corpus and recording conditions as training, so it measures in-domain accuracy rather than generalisation to new speakers or environments.</w:t>
       </w:r>
     </w:p>
     <w:p>
@@ -3294,7 +4211,22 @@
         <w:t xml:space="preserve">Untuned hyperparameters. </w:t>
       </w:r>
       <w:r>
-        <w:t>The LoRA hyperparameters come from a published recipe. They were not tuned, and no claim is made that they are optimal for Persian.</w:t>
+        <w:t>The LoRA rank, alpha and learning rate come from a published recipe. They were not tuned, and no claim is made that they are optimal for Persian.</w:t>
+      </w:r>
+    </w:p>
+    <w:p>
+      <w:pPr>
+        <w:pStyle w:val="ListBullet"/>
+        <w:spacing w:after="40"/>
+      </w:pPr>
+      <w:r>
+        <w:rPr>
+          <w:b/>
+        </w:rPr>
+        <w:t xml:space="preserve">Limited ablation. </w:t>
+      </w:r>
+      <w:r>
+        <w:t>Only two configurations were measured end to end: the shipped recipe, and the same recipe without gradient checkpointing. The relative cost of quantisation and of different hardware was not measured on this corpus, so no figure is quoted for it.</w:t>
       </w:r>
     </w:p>
     <w:sectPr>

</xml_diff>

<commit_message>
Task 3 final: reconcile figure and table on the crossover point
</commit_message>
<xml_diff>
--- a/docs/Task2_Training_Pipeline.docx
+++ b/docs/Task2_Training_Pipeline.docx
@@ -43,9 +43,10 @@
     <w:tbl>
       <w:tblPr>
         <w:tblStyle w:val="TableGrid"/>
-        <w:tblW w:type="auto" w:w="0"/>
         <w:jc w:val="center"/>
+        <w:tblLayout w:type="fixed"/>
         <w:tblLook w:firstColumn="1" w:firstRow="1" w:lastColumn="0" w:lastRow="0" w:noHBand="0" w:noVBand="1" w:val="04A0"/>
+        <w:tblW w:w="9504" w:type="dxa"/>
       </w:tblPr>
       <w:tblGrid>
         <w:gridCol w:w="4730"/>
@@ -371,9 +372,10 @@
     <w:tbl>
       <w:tblPr>
         <w:tblStyle w:val="TableGrid"/>
-        <w:tblW w:type="auto" w:w="0"/>
         <w:jc w:val="center"/>
+        <w:tblLayout w:type="fixed"/>
         <w:tblLook w:firstColumn="1" w:firstRow="1" w:lastColumn="0" w:lastRow="0" w:noHBand="0" w:noVBand="1" w:val="04A0"/>
+        <w:tblW w:w="9504" w:type="dxa"/>
       </w:tblPr>
       <w:tblGrid>
         <w:gridCol w:w="4730"/>
@@ -744,7 +746,22 @@
         <w:rPr>
           <w:b w:val="0"/>
         </w:rPr>
-        <w:t>Undecodable audio is flagged and dropped rather than replaced with silence, and a failure rate above 0.5% aborts the run. No decode failures were logged: all 33,432 training and 5,900 validation samples decoded successfully.</w:t>
+        <w:t>Undecodable audio is flagged and dropped rather than replaced with silence, and a failure rate above 0.5% aborts the run. Nothing was dropped:</w:t>
+      </w:r>
+    </w:p>
+    <w:p>
+      <w:pPr>
+        <w:spacing w:after="140" w:before="40"/>
+        <w:ind w:left="216"/>
+      </w:pPr>
+      <w:r>
+        <w:rPr>
+          <w:rFonts w:ascii="Consolas" w:hAnsi="Consolas"/>
+          <w:sz w:val="17"/>
+        </w:rPr>
+        <w:t>[DECODE] All 33,432 train samples decoded successfully.</w:t>
+        <w:br/>
+        <w:t>[DECODE] All 5,900 validation samples decoded successfully.</w:t>
       </w:r>
     </w:p>
     <w:p>
@@ -774,7 +791,22 @@
         <w:rPr>
           <w:b w:val="0"/>
         </w:rPr>
-        <w:t>A tokenised Persian label begins with four special tokens: &lt;|startoftranscript|&gt; (50258), &lt;|fa|&gt;, &lt;|transcribe|&gt;, &lt;|notimestamps|&gt;. Whisper's shift_tokens_right prepends decoder_start_token_id automatically when building decoder inputs, so a label that still carries its own leading 50258 gives the decoder that prefix twice. The collator strips it — and the comparison must be against decoder_start_token_id (50258), not bos_token_id, which for Whisper is &lt;|endoftext|&gt; (50257) and therefore never matches. Getting this wrong produces no error and no obviously wrong loss curve; see section 7.</w:t>
+        <w:t>A tokenised Persian label begins with four special tokens: &lt;|startoftranscript|&gt; (50258), &lt;|fa|&gt;, &lt;|transcribe|&gt;, &lt;|notimestamps|&gt;. Whisper's shift_tokens_right prepends decoder_start_token_id automatically when building decoder inputs, so a label that still carries its own leading 50258 gives the decoder that prefix twice. The collator strips it — and the comparison must be against decoder_start_token_id (50258), not bos_token_id, which for Whisper is &lt;|endoftext|&gt; (50257) and therefore never matches. Getting this wrong produces no error and no obviously wrong loss curve; see section 7. Both ids are printed at startup so the choice is visible in the log rather than buried in the collator:</w:t>
+      </w:r>
+    </w:p>
+    <w:p>
+      <w:pPr>
+        <w:spacing w:after="140" w:before="40"/>
+        <w:ind w:left="216"/>
+      </w:pPr>
+      <w:r>
+        <w:rPr>
+          <w:rFonts w:ascii="Consolas" w:hAnsi="Consolas"/>
+          <w:sz w:val="17"/>
+        </w:rPr>
+        <w:t>[COLLATOR] decoder_start_token_id (&lt;|startoftranscript|&gt;) = 50258</w:t>
+        <w:br/>
+        <w:t xml:space="preserve">           (tokenizer.bos_token_id = 50257 -- intentionally not used)</w:t>
       </w:r>
     </w:p>
     <w:p>
@@ -788,9 +820,10 @@
     <w:tbl>
       <w:tblPr>
         <w:tblStyle w:val="TableGrid"/>
-        <w:tblW w:type="auto" w:w="0"/>
         <w:jc w:val="center"/>
+        <w:tblLayout w:type="fixed"/>
         <w:tblLook w:firstColumn="1" w:firstRow="1" w:lastColumn="0" w:lastRow="0" w:noHBand="0" w:noVBand="1" w:val="04A0"/>
+        <w:tblW w:w="9504" w:type="dxa"/>
       </w:tblPr>
       <w:tblGrid>
         <w:gridCol w:w="2365"/>
@@ -1277,7 +1310,7 @@
     <w:p>
       <w:pPr>
         <w:pStyle w:val="ListBullet"/>
-        <w:spacing w:after="120"/>
+        <w:spacing w:after="40"/>
       </w:pPr>
       <w:r>
         <w:rPr>
@@ -1291,6 +1324,21 @@
     </w:p>
     <w:p>
       <w:pPr>
+        <w:pStyle w:val="ListBullet"/>
+        <w:spacing w:after="120"/>
+      </w:pPr>
+      <w:r>
+        <w:rPr>
+          <w:b/>
+        </w:rPr>
+        <w:t xml:space="preserve">a safe_base_forward wrapper — </w:t>
+      </w:r>
+      <w:r>
+        <w:t>a thin wrapper on base_model.forward that drops input_ids, inputs_embeds and attention_mask when PEFT passes them as None. PEFT injects those keywords generically, Whisper's forward signature rejects them, and the collision aborts the first step. Removing the None-valued keys is narrower than pinning an older library version and leaves everything else untouched.</w:t>
+      </w:r>
+    </w:p>
+    <w:p>
+      <w:pPr>
         <w:pStyle w:val="Heading1"/>
       </w:pPr>
       <w:r>
@@ -1300,9 +1348,10 @@
     <w:tbl>
       <w:tblPr>
         <w:tblStyle w:val="TableGrid"/>
-        <w:tblW w:type="auto" w:w="0"/>
         <w:jc w:val="center"/>
+        <w:tblLayout w:type="fixed"/>
         <w:tblLook w:firstColumn="1" w:firstRow="1" w:lastColumn="0" w:lastRow="0" w:noHBand="0" w:noVBand="1" w:val="04A0"/>
+        <w:tblW w:w="9504" w:type="dxa"/>
       </w:tblPr>
       <w:tblGrid>
         <w:gridCol w:w="2365"/>
@@ -1845,7 +1894,24 @@
         <w:rPr>
           <w:b w:val="0"/>
         </w:rPr>
-        <w:t>Each in-training evaluation took 586 seconds over a fixed 1,500-row subset; the final evaluation took 6,779 seconds over the full 5,900 rows, or 1.15 s per sample. The periodic evaluations were capped at that subset for exactly this reason, and the reported headline metrics come from the full-split run at the end. This is why the in-training figure at step 6,270 is 8.17% while the reported WER is 8.05%: different sample counts, not different models.</w:t>
+        <w:t>Each in-training evaluation took 586 seconds over a fixed 500-row subset; the final evaluation took 6,779 seconds over the full 5,900 rows, or 1.15 s per sample. The periodic evaluations were capped for exactly this reason, and the headline metrics come from the full-split run at the end. This is why the in-training figure at step 6,270 is 8.17% while the reported WER is 8.05% — different sample counts, one model. The subset size is fixed and seeded so every evaluation point is comparable with the others:</w:t>
+      </w:r>
+    </w:p>
+    <w:p>
+      <w:pPr>
+        <w:spacing w:after="140" w:before="40"/>
+        <w:ind w:left="216"/>
+      </w:pPr>
+      <w:r>
+        <w:rPr>
+          <w:rFonts w:ascii="Consolas" w:hAnsi="Consolas"/>
+          <w:sz w:val="17"/>
+        </w:rPr>
+        <w:t>[EVAL SUBSET] Periodic evaluation will use 500 of 5,900 validation rows</w:t>
+        <w:br/>
+        <w:t xml:space="preserve">              (deterministic, seed=42). Use --final_full_eval to report final</w:t>
+        <w:br/>
+        <w:t xml:space="preserve">              metrics on the full split.</w:t>
       </w:r>
     </w:p>
     <w:p>
@@ -1873,9 +1939,10 @@
     <w:tbl>
       <w:tblPr>
         <w:tblStyle w:val="TableGrid"/>
-        <w:tblW w:type="auto" w:w="0"/>
         <w:jc w:val="center"/>
+        <w:tblLayout w:type="fixed"/>
         <w:tblLook w:firstColumn="1" w:firstRow="1" w:lastColumn="0" w:lastRow="0" w:noHBand="0" w:noVBand="1" w:val="04A0"/>
+        <w:tblW w:w="9504" w:type="dxa"/>
       </w:tblPr>
       <w:tblGrid>
         <w:gridCol w:w="1577"/>
@@ -2754,9 +2821,10 @@
     <w:tbl>
       <w:tblPr>
         <w:tblStyle w:val="TableGrid"/>
-        <w:tblW w:type="auto" w:w="0"/>
         <w:jc w:val="center"/>
+        <w:tblLayout w:type="fixed"/>
         <w:tblLook w:firstColumn="1" w:firstRow="1" w:lastColumn="0" w:lastRow="0" w:noHBand="0" w:noVBand="1" w:val="04A0"/>
+        <w:tblW w:w="9504" w:type="dxa"/>
       </w:tblPr>
       <w:tblGrid>
         <w:gridCol w:w="3154"/>
@@ -3092,9 +3160,10 @@
     <w:tbl>
       <w:tblPr>
         <w:tblStyle w:val="TableGrid"/>
-        <w:tblW w:type="auto" w:w="0"/>
         <w:jc w:val="center"/>
+        <w:tblLayout w:type="fixed"/>
         <w:tblLook w:firstColumn="1" w:firstRow="1" w:lastColumn="0" w:lastRow="0" w:noHBand="0" w:noVBand="1" w:val="04A0"/>
+        <w:tblW w:w="9504" w:type="dxa"/>
       </w:tblPr>
       <w:tblGrid>
         <w:gridCol w:w="4730"/>
@@ -3368,9 +3437,10 @@
     <w:tbl>
       <w:tblPr>
         <w:tblStyle w:val="TableGrid"/>
-        <w:tblW w:type="auto" w:w="0"/>
         <w:jc w:val="center"/>
+        <w:tblLayout w:type="fixed"/>
         <w:tblLook w:firstColumn="1" w:firstRow="1" w:lastColumn="0" w:lastRow="0" w:noHBand="0" w:noVBand="1" w:val="04A0"/>
+        <w:tblW w:w="9504" w:type="dxa"/>
       </w:tblPr>
       <w:tblGrid>
         <w:gridCol w:w="4730"/>
@@ -3622,9 +3692,10 @@
     <w:tbl>
       <w:tblPr>
         <w:tblStyle w:val="TableGrid"/>
-        <w:tblW w:type="auto" w:w="0"/>
         <w:jc w:val="center"/>
+        <w:tblLayout w:type="fixed"/>
         <w:tblLook w:firstColumn="1" w:firstRow="1" w:lastColumn="0" w:lastRow="0" w:noHBand="0" w:noVBand="1" w:val="04A0"/>
+        <w:tblW w:w="9504" w:type="dxa"/>
       </w:tblPr>
       <w:tblGrid>
         <w:gridCol w:w="2365"/>
@@ -4129,7 +4200,21 @@
         <w:rPr>
           <w:b w:val="0"/>
         </w:rPr>
-        <w:t>Gradient checkpointing is a requirement on this hardware, not a tuning knob. This was measured: two ablation runs with --no_gradient_checkpointing both died with CUDA out of memory against the card's 22.03 GiB. With it enabled the real run peaked at 5.51 GiB, using a quarter of the card — so the memory headroom in the shipped configuration is entirely a product of checkpointing, not of the model being small.</w:t>
+        <w:t>Gradient checkpointing is a requirement on this hardware, not a tuning knob. Two ablation runs with --no_gradient_checkpointing both died with CUDA out of memory against the card's 22.03 GiB — one inside the encoder feed-forward, one inside a LoRA projection. With it enabled the run peaked at 5.51 GiB, a quarter of the card, so the headroom in the shipped configuration is entirely a product of checkpointing rather than of the model being small. The comment in src/config.py previously claimed the opposite; it was corrected against these logs.</w:t>
+      </w:r>
+    </w:p>
+    <w:p>
+      <w:r>
+        <w:rPr>
+          <w:b/>
+        </w:rPr>
+        <w:t xml:space="preserve">What the third ablation produced. </w:t>
+      </w:r>
+      <w:r>
+        <w:rPr>
+          <w:b w:val="0"/>
+        </w:rPr>
+        <w:t>An unquantized run was also attempted and never reached a timing: it raised "Input type (float) and bias type (c10::Half) should be the same" inside the encoder convolution. The cause is that whisper-large-v3 declares torch_dtype: float16 in its own config.json, so omitting an explicit dtype loads 16-bit weights, which then meet fp32 input features. The failure is the reason src/model.py now requests dtype=torch.float32 explicitly on the unquantized path and asserts the loaded dtype afterwards. The ablation produced no speed number, but it did find a real bug.</w:t>
       </w:r>
     </w:p>
     <w:p>
@@ -4226,7 +4311,7 @@
         <w:t xml:space="preserve">Limited ablation. </w:t>
       </w:r>
       <w:r>
-        <w:t>Only two configurations were measured end to end: the shipped recipe, and the same recipe without gradient checkpointing. The relative cost of quantisation and of different hardware was not measured on this corpus, so no figure is quoted for it.</w:t>
+        <w:t>Three configurations were attempted. The shipped recipe completed; the no-checkpointing variant established a memory requirement by failing twice; the unquantized variant crashed on a dtype mismatch before producing a timing. The relative speed of quantised against unquantised training was therefore never measured on this corpus, and no figure is quoted for it.</w:t>
       </w:r>
     </w:p>
     <w:sectPr>

</xml_diff>

<commit_message>
Task 5 index; correct the dependency-pinning claim
</commit_message>
<xml_diff>
--- a/docs/Task2_Training_Pipeline.docx
+++ b/docs/Task2_Training_Pipeline.docx
@@ -3412,7 +3412,7 @@
                 <w:b w:val="0"/>
                 <w:sz w:val="18"/>
               </w:rPr>
-              <w:t>pinned in requirements.txt</w:t>
+              <w:t>minimum versions declared in requirements.txt — see the limitation noted in section 10</w:t>
             </w:r>
           </w:p>
         </w:tc>
@@ -4308,6 +4308,21 @@
         <w:rPr>
           <w:b/>
         </w:rPr>
+        <w:t xml:space="preserve">No dependency lock. </w:t>
+      </w:r>
+      <w:r>
+        <w:t>requirements.txt declares minimum versions, not exact ones, and the run's environment was not captured with pip freeze before the machine was released. Seeds, configuration and data are all fixed, so the pipeline is reproducible in every respect except the library versions it runs against.</w:t>
+      </w:r>
+    </w:p>
+    <w:p>
+      <w:pPr>
+        <w:pStyle w:val="ListBullet"/>
+        <w:spacing w:after="40"/>
+      </w:pPr>
+      <w:r>
+        <w:rPr>
+          <w:b/>
+        </w:rPr>
         <w:t xml:space="preserve">Limited ablation. </w:t>
       </w:r>
       <w:r>

</xml_diff>

<commit_message>
Task 2: correct the punctuation claim; state the ZWNJ decision explicitly
</commit_message>
<xml_diff>
--- a/docs/Task2_Training_Pipeline.docx
+++ b/docs/Task2_Training_Pipeline.docx
@@ -1857,7 +1857,7 @@
     </w:p>
     <w:p>
       <w:pPr>
-        <w:spacing w:after="80"/>
+        <w:spacing w:after="60"/>
       </w:pPr>
       <w:r>
         <w:rPr>
@@ -1869,7 +1869,29 @@
         <w:rPr>
           <w:b w:val="0"/>
         </w:rPr>
-        <w:t>Arabic characters are mapped to Persian, diacritics removed, punctuation stripped and whitespace collapsed. The model was never trained to predict punctuation, so penalising its absence would measure the reference's typography rather than transcription quality. That makes the reported figures lower than raw ones, so both are given rather than only the flattering half:</w:t>
+        <w:t>Arabic characters are mapped to Persian, diacritics removed, punctuation stripped and whitespace collapsed. Zero-width non-joiners are deliberately left alone, so می‌رود and می رود remain two different strings and the difference between them is counted — the consequences of that are measured in Task 4.</w:t>
+      </w:r>
+    </w:p>
+    <w:p>
+      <w:pPr>
+        <w:spacing w:after="80"/>
+      </w:pPr>
+      <w:r>
+        <w:rPr>
+          <w:i w:val="0"/>
+        </w:rPr>
+        <w:t>Punctuation needs stating carefully, because it is easy to describe wrongly. It is present in the training labels: 80.9% of them carry it, and the model is trained to produce it and does. It is stripped from both sides at scoring time for a different reason — the references punctuate inconsistently, so charging the model for reproducing that inconsistency would measure the annotators' typography rather than transcription. The model is not being excused for something it cannot do; it is being scored on the part of the output that is well defined.</w:t>
+      </w:r>
+    </w:p>
+    <w:p>
+      <w:pPr>
+        <w:spacing w:after="80"/>
+      </w:pPr>
+      <w:r>
+        <w:rPr>
+          <w:i w:val="0"/>
+        </w:rPr>
+        <w:t>That makes the reported figures lower than raw ones, so both are given rather than only the flattering half:</w:t>
       </w:r>
     </w:p>
     <w:tbl>

</xml_diff>

<commit_message>
Add the zero-shot baseline: WER 37.36% before, 8.74% after
</commit_message>
<xml_diff>
--- a/docs/Task2_Training_Pipeline.docx
+++ b/docs/Task2_Training_Pipeline.docx
@@ -1927,7 +1927,7 @@
                 <w:b/>
                 <w:sz w:val="18"/>
               </w:rPr>
-              <w:t>Scored over 200 validation utterances</w:t>
+              <w:t>Scored over the same 200 validation utterances</w:t>
             </w:r>
           </w:p>
         </w:tc>
@@ -2087,7 +2087,7 @@
                 <w:b w:val="0"/>
                 <w:sz w:val="18"/>
               </w:rPr>
-              <w:t>Normalised — the basis for every figure quoted here</w:t>
+              <w:t>Normalised — the scoring method used throughout</w:t>
             </w:r>
           </w:p>
         </w:tc>
@@ -2160,7 +2160,21 @@
         <w:rPr>
           <w:i w:val="0"/>
         </w:rPr>
-        <w:t>Punctuation and character variants are worth 2.03 WER points. A deployment that needs punctuated output should read the raw column, because that is what a reader would see; the normalised column is the one that measures transcription rather than typography. The training pipeline logs only the normalised metric, which is the more useful default but hides this gap — printing both at every evaluation would be the better choice, and is a change I would make.</w:t>
+        <w:t>Punctuation and character variants are worth about two WER points. A deployment that needs punctuated output should read the raw column, because that is what a reader would see; the normalised column measures transcription rather than typography. The training pipeline logs only the normalised metric, which is the more useful default but hides this gap — printing both at every evaluation would be the better choice, and is a change I would make.</w:t>
+      </w:r>
+    </w:p>
+    <w:p>
+      <w:r>
+        <w:rPr>
+          <w:b/>
+        </w:rPr>
+        <w:t xml:space="preserve">These 200 utterances are used only to separate the two scoring methods. </w:t>
+      </w:r>
+      <w:r>
+        <w:rPr>
+          <w:b w:val="0"/>
+        </w:rPr>
+        <w:t>The headline WER of 8.05% comes from the full 5,900-row evaluation; 8.74% is the same model measured on a 200-row subsample, and section 1 shows the two agree within sampling error. Nothing in this document rests on the difference between them.</w:t>
       </w:r>
     </w:p>
     <w:p>
@@ -3980,7 +3994,629 @@
         <w:pStyle w:val="Heading1"/>
       </w:pPr>
       <w:r>
-        <w:t>9. Results and cost</w:t>
+        <w:t>9. What the fine-tuning actually bought</w:t>
+      </w:r>
+    </w:p>
+    <w:p>
+      <w:pPr>
+        <w:spacing w:after="80"/>
+      </w:pPr>
+      <w:r>
+        <w:rPr>
+          <w:i w:val="0"/>
+        </w:rPr>
+        <w:t>A WER of 8.05% means nothing on its own without knowing what the untouched model scores on the same audio. The baseline was measured by running the identical script with the adapter switched off — same 200 utterances, same seed, same preprocessing, same generation settings, so the only difference between the two columns is the adapter.</w:t>
+      </w:r>
+    </w:p>
+    <w:tbl>
+      <w:tblPr>
+        <w:tblStyle w:val="TableGrid"/>
+        <w:jc w:val="center"/>
+        <w:tblLayout w:type="fixed"/>
+        <w:tblLook w:firstColumn="1" w:firstRow="1" w:lastColumn="0" w:lastRow="0" w:noHBand="0" w:noVBand="1" w:val="04A0"/>
+        <w:tblW w:w="9504" w:type="dxa"/>
+      </w:tblPr>
+      <w:tblGrid>
+        <w:gridCol w:w="2365"/>
+        <w:gridCol w:w="2365"/>
+        <w:gridCol w:w="2365"/>
+        <w:gridCol w:w="2365"/>
+      </w:tblGrid>
+      <w:tr>
+        <w:trPr>
+          <w:tblHeader w:val="true"/>
+        </w:trPr>
+        <w:tc>
+          <w:tcPr>
+            <w:tcW w:type="dxa" w:w="3168"/>
+            <w:shd w:val="clear" w:fill="DCE6F1"/>
+          </w:tcPr>
+          <w:p>
+            <w:pPr>
+              <w:spacing w:before="20" w:after="20"/>
+            </w:pPr>
+            <w:r/>
+            <w:r>
+              <w:rPr>
+                <w:b/>
+                <w:sz w:val="18"/>
+              </w:rPr>
+              <w:t>Scored over the same 200 utterances</w:t>
+            </w:r>
+          </w:p>
+        </w:tc>
+        <w:tc>
+          <w:tcPr>
+            <w:tcW w:type="dxa" w:w="2304"/>
+            <w:shd w:val="clear" w:fill="DCE6F1"/>
+          </w:tcPr>
+          <w:p>
+            <w:pPr>
+              <w:spacing w:before="20" w:after="20"/>
+            </w:pPr>
+            <w:r/>
+            <w:r>
+              <w:rPr>
+                <w:b/>
+                <w:sz w:val="18"/>
+              </w:rPr>
+              <w:t>Base whisper-large-v3</w:t>
+            </w:r>
+          </w:p>
+        </w:tc>
+        <w:tc>
+          <w:tcPr>
+            <w:tcW w:type="dxa" w:w="2016"/>
+            <w:shd w:val="clear" w:fill="DCE6F1"/>
+          </w:tcPr>
+          <w:p>
+            <w:pPr>
+              <w:spacing w:before="20" w:after="20"/>
+            </w:pPr>
+            <w:r/>
+            <w:r>
+              <w:rPr>
+                <w:b/>
+                <w:sz w:val="18"/>
+              </w:rPr>
+              <w:t>After fine-tuning</w:t>
+            </w:r>
+          </w:p>
+        </w:tc>
+        <w:tc>
+          <w:tcPr>
+            <w:tcW w:type="dxa" w:w="2016"/>
+            <w:shd w:val="clear" w:fill="DCE6F1"/>
+          </w:tcPr>
+          <w:p>
+            <w:pPr>
+              <w:spacing w:before="20" w:after="20"/>
+            </w:pPr>
+            <w:r/>
+            <w:r>
+              <w:rPr>
+                <w:b/>
+                <w:sz w:val="18"/>
+              </w:rPr>
+              <w:t>Change</w:t>
+            </w:r>
+          </w:p>
+        </w:tc>
+      </w:tr>
+      <w:tr>
+        <w:trPr>
+          <w:cantSplit/>
+        </w:trPr>
+        <w:tc>
+          <w:tcPr>
+            <w:tcW w:type="dxa" w:w="3168"/>
+          </w:tcPr>
+          <w:p>
+            <w:pPr>
+              <w:spacing w:before="20" w:after="20"/>
+            </w:pPr>
+            <w:r/>
+            <w:r>
+              <w:rPr>
+                <w:b w:val="0"/>
+                <w:sz w:val="18"/>
+              </w:rPr>
+              <w:t>Corpus WER, normalised</w:t>
+            </w:r>
+          </w:p>
+        </w:tc>
+        <w:tc>
+          <w:tcPr>
+            <w:tcW w:type="dxa" w:w="2304"/>
+          </w:tcPr>
+          <w:p>
+            <w:pPr>
+              <w:spacing w:before="20" w:after="20"/>
+              <w:jc w:val="right"/>
+            </w:pPr>
+            <w:r/>
+            <w:r>
+              <w:rPr>
+                <w:b w:val="0"/>
+                <w:sz w:val="18"/>
+              </w:rPr>
+              <w:t>37.36%</w:t>
+            </w:r>
+          </w:p>
+        </w:tc>
+        <w:tc>
+          <w:tcPr>
+            <w:tcW w:type="dxa" w:w="2016"/>
+          </w:tcPr>
+          <w:p>
+            <w:pPr>
+              <w:spacing w:before="20" w:after="20"/>
+              <w:jc w:val="right"/>
+            </w:pPr>
+            <w:r/>
+            <w:r>
+              <w:rPr>
+                <w:b w:val="0"/>
+                <w:sz w:val="18"/>
+              </w:rPr>
+              <w:t>8.74%</w:t>
+            </w:r>
+          </w:p>
+        </w:tc>
+        <w:tc>
+          <w:tcPr>
+            <w:tcW w:type="dxa" w:w="2016"/>
+          </w:tcPr>
+          <w:p>
+            <w:pPr>
+              <w:spacing w:before="20" w:after="20"/>
+              <w:jc w:val="right"/>
+            </w:pPr>
+            <w:r/>
+            <w:r>
+              <w:rPr>
+                <w:b w:val="0"/>
+                <w:sz w:val="18"/>
+              </w:rPr>
+              <w:t>−28.6 points</w:t>
+            </w:r>
+          </w:p>
+        </w:tc>
+      </w:tr>
+      <w:tr>
+        <w:trPr>
+          <w:cantSplit/>
+        </w:trPr>
+        <w:tc>
+          <w:tcPr>
+            <w:tcW w:type="dxa" w:w="3168"/>
+          </w:tcPr>
+          <w:p>
+            <w:pPr>
+              <w:spacing w:before="20" w:after="20"/>
+            </w:pPr>
+            <w:r/>
+            <w:r>
+              <w:rPr>
+                <w:b w:val="0"/>
+                <w:sz w:val="18"/>
+              </w:rPr>
+              <w:t>Corpus CER, normalised</w:t>
+            </w:r>
+          </w:p>
+        </w:tc>
+        <w:tc>
+          <w:tcPr>
+            <w:tcW w:type="dxa" w:w="2304"/>
+          </w:tcPr>
+          <w:p>
+            <w:pPr>
+              <w:spacing w:before="20" w:after="20"/>
+              <w:jc w:val="right"/>
+            </w:pPr>
+            <w:r/>
+            <w:r>
+              <w:rPr>
+                <w:b w:val="0"/>
+                <w:sz w:val="18"/>
+              </w:rPr>
+              <w:t>8.91%</w:t>
+            </w:r>
+          </w:p>
+        </w:tc>
+        <w:tc>
+          <w:tcPr>
+            <w:tcW w:type="dxa" w:w="2016"/>
+          </w:tcPr>
+          <w:p>
+            <w:pPr>
+              <w:spacing w:before="20" w:after="20"/>
+              <w:jc w:val="right"/>
+            </w:pPr>
+            <w:r/>
+            <w:r>
+              <w:rPr>
+                <w:b w:val="0"/>
+                <w:sz w:val="18"/>
+              </w:rPr>
+              <w:t>2.14%</w:t>
+            </w:r>
+          </w:p>
+        </w:tc>
+        <w:tc>
+          <w:tcPr>
+            <w:tcW w:type="dxa" w:w="2016"/>
+          </w:tcPr>
+          <w:p>
+            <w:pPr>
+              <w:spacing w:before="20" w:after="20"/>
+              <w:jc w:val="right"/>
+            </w:pPr>
+            <w:r/>
+            <w:r>
+              <w:rPr>
+                <w:b w:val="0"/>
+                <w:sz w:val="18"/>
+              </w:rPr>
+              <w:t>−6.8 points</w:t>
+            </w:r>
+          </w:p>
+        </w:tc>
+      </w:tr>
+      <w:tr>
+        <w:trPr>
+          <w:cantSplit/>
+        </w:trPr>
+        <w:tc>
+          <w:tcPr>
+            <w:tcW w:type="dxa" w:w="3168"/>
+          </w:tcPr>
+          <w:p>
+            <w:pPr>
+              <w:spacing w:before="20" w:after="20"/>
+            </w:pPr>
+            <w:r/>
+            <w:r>
+              <w:rPr>
+                <w:b w:val="0"/>
+                <w:sz w:val="18"/>
+              </w:rPr>
+              <w:t>Corpus WER, raw</w:t>
+            </w:r>
+          </w:p>
+        </w:tc>
+        <w:tc>
+          <w:tcPr>
+            <w:tcW w:type="dxa" w:w="2304"/>
+          </w:tcPr>
+          <w:p>
+            <w:pPr>
+              <w:spacing w:before="20" w:after="20"/>
+              <w:jc w:val="right"/>
+            </w:pPr>
+            <w:r/>
+            <w:r>
+              <w:rPr>
+                <w:b w:val="0"/>
+                <w:sz w:val="18"/>
+              </w:rPr>
+              <w:t>40.97%</w:t>
+            </w:r>
+          </w:p>
+        </w:tc>
+        <w:tc>
+          <w:tcPr>
+            <w:tcW w:type="dxa" w:w="2016"/>
+          </w:tcPr>
+          <w:p>
+            <w:pPr>
+              <w:spacing w:before="20" w:after="20"/>
+              <w:jc w:val="right"/>
+            </w:pPr>
+            <w:r/>
+            <w:r>
+              <w:rPr>
+                <w:b w:val="0"/>
+                <w:sz w:val="18"/>
+              </w:rPr>
+              <w:t>10.76%</w:t>
+            </w:r>
+          </w:p>
+        </w:tc>
+        <w:tc>
+          <w:tcPr>
+            <w:tcW w:type="dxa" w:w="2016"/>
+          </w:tcPr>
+          <w:p>
+            <w:pPr>
+              <w:spacing w:before="20" w:after="20"/>
+              <w:jc w:val="right"/>
+            </w:pPr>
+            <w:r/>
+            <w:r>
+              <w:rPr>
+                <w:b w:val="0"/>
+                <w:sz w:val="18"/>
+              </w:rPr>
+              <w:t>−30.2 points</w:t>
+            </w:r>
+          </w:p>
+        </w:tc>
+      </w:tr>
+      <w:tr>
+        <w:trPr>
+          <w:cantSplit/>
+        </w:trPr>
+        <w:tc>
+          <w:tcPr>
+            <w:tcW w:type="dxa" w:w="3168"/>
+          </w:tcPr>
+          <w:p>
+            <w:pPr>
+              <w:spacing w:before="20" w:after="20"/>
+            </w:pPr>
+            <w:r/>
+            <w:r>
+              <w:rPr>
+                <w:b w:val="0"/>
+                <w:sz w:val="18"/>
+              </w:rPr>
+              <w:t>Utterances transcribed exactly</w:t>
+            </w:r>
+          </w:p>
+        </w:tc>
+        <w:tc>
+          <w:tcPr>
+            <w:tcW w:type="dxa" w:w="2304"/>
+          </w:tcPr>
+          <w:p>
+            <w:pPr>
+              <w:spacing w:before="20" w:after="20"/>
+              <w:jc w:val="right"/>
+            </w:pPr>
+            <w:r/>
+            <w:r>
+              <w:rPr>
+                <w:b w:val="0"/>
+                <w:sz w:val="18"/>
+              </w:rPr>
+              <w:t>23  (11.5%)</w:t>
+            </w:r>
+          </w:p>
+        </w:tc>
+        <w:tc>
+          <w:tcPr>
+            <w:tcW w:type="dxa" w:w="2016"/>
+          </w:tcPr>
+          <w:p>
+            <w:pPr>
+              <w:spacing w:before="20" w:after="20"/>
+              <w:jc w:val="right"/>
+            </w:pPr>
+            <w:r/>
+            <w:r>
+              <w:rPr>
+                <w:b w:val="0"/>
+                <w:sz w:val="18"/>
+              </w:rPr>
+              <w:t>115  (57.5%)</w:t>
+            </w:r>
+          </w:p>
+        </w:tc>
+        <w:tc>
+          <w:tcPr>
+            <w:tcW w:type="dxa" w:w="2016"/>
+          </w:tcPr>
+          <w:p>
+            <w:pPr>
+              <w:spacing w:before="20" w:after="20"/>
+              <w:jc w:val="right"/>
+            </w:pPr>
+            <w:r/>
+            <w:r>
+              <w:rPr>
+                <w:b w:val="0"/>
+                <w:sz w:val="18"/>
+              </w:rPr>
+              <w:t>5× more</w:t>
+            </w:r>
+          </w:p>
+        </w:tc>
+      </w:tr>
+      <w:tr>
+        <w:trPr>
+          <w:cantSplit/>
+        </w:trPr>
+        <w:tc>
+          <w:tcPr>
+            <w:tcW w:type="dxa" w:w="3168"/>
+          </w:tcPr>
+          <w:p>
+            <w:pPr>
+              <w:spacing w:before="20" w:after="20"/>
+            </w:pPr>
+            <w:r/>
+            <w:r>
+              <w:rPr>
+                <w:b w:val="0"/>
+                <w:sz w:val="18"/>
+              </w:rPr>
+              <w:t>Predictions containing a digit</w:t>
+            </w:r>
+          </w:p>
+        </w:tc>
+        <w:tc>
+          <w:tcPr>
+            <w:tcW w:type="dxa" w:w="2304"/>
+          </w:tcPr>
+          <w:p>
+            <w:pPr>
+              <w:spacing w:before="20" w:after="20"/>
+              <w:jc w:val="right"/>
+            </w:pPr>
+            <w:r/>
+            <w:r>
+              <w:rPr>
+                <w:b w:val="0"/>
+                <w:sz w:val="18"/>
+              </w:rPr>
+              <w:t>4</w:t>
+            </w:r>
+          </w:p>
+        </w:tc>
+        <w:tc>
+          <w:tcPr>
+            <w:tcW w:type="dxa" w:w="2016"/>
+          </w:tcPr>
+          <w:p>
+            <w:pPr>
+              <w:spacing w:before="20" w:after="20"/>
+              <w:jc w:val="right"/>
+            </w:pPr>
+            <w:r/>
+            <w:r>
+              <w:rPr>
+                <w:b w:val="0"/>
+                <w:sz w:val="18"/>
+              </w:rPr>
+              <w:t>0</w:t>
+            </w:r>
+          </w:p>
+        </w:tc>
+        <w:tc>
+          <w:tcPr>
+            <w:tcW w:type="dxa" w:w="2016"/>
+          </w:tcPr>
+          <w:p>
+            <w:pPr>
+              <w:spacing w:before="20" w:after="20"/>
+              <w:jc w:val="right"/>
+            </w:pPr>
+            <w:r/>
+            <w:r>
+              <w:rPr>
+                <w:b w:val="0"/>
+                <w:sz w:val="18"/>
+              </w:rPr>
+              <w:t>eliminated</w:t>
+            </w:r>
+          </w:p>
+        </w:tc>
+      </w:tr>
+      <w:tr>
+        <w:trPr>
+          <w:cantSplit/>
+        </w:trPr>
+        <w:tc>
+          <w:tcPr>
+            <w:tcW w:type="dxa" w:w="3168"/>
+          </w:tcPr>
+          <w:p>
+            <w:pPr>
+              <w:spacing w:before="20" w:after="20"/>
+            </w:pPr>
+            <w:r/>
+            <w:r>
+              <w:rPr>
+                <w:b w:val="0"/>
+                <w:sz w:val="18"/>
+              </w:rPr>
+              <w:t>Predictions using a ZWNJ</w:t>
+            </w:r>
+          </w:p>
+        </w:tc>
+        <w:tc>
+          <w:tcPr>
+            <w:tcW w:type="dxa" w:w="2304"/>
+          </w:tcPr>
+          <w:p>
+            <w:pPr>
+              <w:spacing w:before="20" w:after="20"/>
+              <w:jc w:val="right"/>
+            </w:pPr>
+            <w:r/>
+            <w:r>
+              <w:rPr>
+                <w:b w:val="0"/>
+                <w:sz w:val="18"/>
+              </w:rPr>
+              <w:t>0</w:t>
+            </w:r>
+          </w:p>
+        </w:tc>
+        <w:tc>
+          <w:tcPr>
+            <w:tcW w:type="dxa" w:w="2016"/>
+          </w:tcPr>
+          <w:p>
+            <w:pPr>
+              <w:spacing w:before="20" w:after="20"/>
+              <w:jc w:val="right"/>
+            </w:pPr>
+            <w:r/>
+            <w:r>
+              <w:rPr>
+                <w:b w:val="0"/>
+                <w:sz w:val="18"/>
+              </w:rPr>
+              <w:t>116</w:t>
+            </w:r>
+          </w:p>
+        </w:tc>
+        <w:tc>
+          <w:tcPr>
+            <w:tcW w:type="dxa" w:w="2016"/>
+          </w:tcPr>
+          <w:p>
+            <w:pPr>
+              <w:spacing w:before="20" w:after="20"/>
+              <w:jc w:val="right"/>
+            </w:pPr>
+            <w:r/>
+            <w:r>
+              <w:rPr>
+                <w:b w:val="0"/>
+                <w:sz w:val="18"/>
+              </w:rPr>
+              <w:t>learned</w:t>
+            </w:r>
+          </w:p>
+        </w:tc>
+      </w:tr>
+    </w:tbl>
+    <w:p>
+      <w:pPr>
+        <w:spacing w:after="20"/>
+      </w:pPr>
+    </w:p>
+    <w:p>
+      <w:r>
+        <w:rPr>
+          <w:i w:val="0"/>
+        </w:rPr>
+        <w:t>Word error rate fell to roughly a quarter of the baseline, and the number of utterances that come back exactly right went up fivefold. Those are the figures that describe what the training run was for.</w:t>
+      </w:r>
+    </w:p>
+    <w:p>
+      <w:r>
+        <w:rPr>
+          <w:b/>
+        </w:rPr>
+        <w:t xml:space="preserve">The last two rows are the more interesting ones. </w:t>
+      </w:r>
+      <w:r>
+        <w:rPr>
+          <w:b w:val="0"/>
+        </w:rPr>
+        <w:t>The base model produced digits four times, writing 99% where the reference has the number spelled out — exactly the mismatch the Task 1 lexicalisation was meant to remove, and the fine-tuned model never does it. More strikingly, the base model did not use a zero-width non-joiner once in 200 predictions, while the references use one in 118 of them and the fine-tuned model in 116. Whisper writes Persian compounds with plain spaces; this corpus does not. Learning that convention is invisible in the WER headline but is a large part of what the adapter actually learned.</w:t>
+      </w:r>
+    </w:p>
+    <w:p>
+      <w:pPr>
+        <w:pStyle w:val="Heading1"/>
+      </w:pPr>
+      <w:r>
+        <w:t>Cost</w:t>
       </w:r>
     </w:p>
     <w:tbl>

</xml_diff>

<commit_message>
Fix cross-references, section numbering, and the punctuation figure
</commit_message>
<xml_diff>
--- a/docs/Task2_Training_Pipeline.docx
+++ b/docs/Task2_Training_Pipeline.docx
@@ -1589,7 +1589,7 @@
                 <w:b w:val="0"/>
                 <w:sz w:val="18"/>
               </w:rPr>
-              <w:t>enabled (required — §9)</w:t>
+              <w:t>enabled (required — §10)</w:t>
             </w:r>
           </w:p>
         </w:tc>
@@ -1880,7 +1880,7 @@
         <w:rPr>
           <w:i w:val="0"/>
         </w:rPr>
-        <w:t>Punctuation needs stating carefully, because it is easy to describe wrongly. It is present in the training labels: 80.9% of them carry it, and the model is trained to produce it and does. It is stripped from both sides at scoring time for a different reason — the references punctuate inconsistently, so charging the model for reproducing that inconsistency would measure the annotators' typography rather than transcription. The model is not being excused for something it cannot do; it is being scored on the part of the output that is well defined.</w:t>
+        <w:t>Punctuation needs stating carefully, because it is easy to describe wrongly. It is present in the training labels: 31,813 of 39,332 records, 80.9%, contain at least one character the scorer strips. The model is trained to produce it and does. It is stripped from both sides at scoring time for a different reason — the references punctuate inconsistently, so charging the model for reproducing that inconsistency would measure the annotators' typography rather than transcription. The model is not being excused for something it cannot do; it is being scored on the part of the output that is well defined.</w:t>
       </w:r>
     </w:p>
     <w:p>
@@ -2174,7 +2174,7 @@
         <w:rPr>
           <w:b w:val="0"/>
         </w:rPr>
-        <w:t>The headline WER of 8.05% comes from the full 5,900-row evaluation; 8.74% is the same model measured on a 200-row subsample, and section 1 shows the two agree within sampling error. Nothing in this document rests on the difference between them.</w:t>
+        <w:t>The headline WER of 8.05% comes from the full 5,900-row evaluation; 8.74% is the same model measured on a 200-row subsample. The same effect is visible in the evaluation history below: the 500-row in-training subset scored 8.17% where the full split scored 8.05%, and 200 rows scatter more than 500. Nothing in this document rests on the difference between them.</w:t>
       </w:r>
     </w:p>
     <w:p>
@@ -4616,7 +4616,7 @@
         <w:pStyle w:val="Heading1"/>
       </w:pPr>
       <w:r>
-        <w:t>Cost</w:t>
+        <w:t>10. Cost</w:t>
       </w:r>
     </w:p>
     <w:tbl>
@@ -5166,7 +5166,7 @@
         <w:pStyle w:val="Heading1"/>
       </w:pPr>
       <w:r>
-        <w:t>10. Known limitations</w:t>
+        <w:t>11. Known limitations</w:t>
       </w:r>
     </w:p>
     <w:p>

</xml_diff>

<commit_message>
Task 2: state the baseline quantisation and reconcile the three sample sizes
</commit_message>
<xml_diff>
--- a/docs/Task2_Training_Pipeline.docx
+++ b/docs/Task2_Training_Pipeline.docx
@@ -2227,6 +2227,20 @@
         <w:rPr>
           <w:b/>
         </w:rPr>
+        <w:t xml:space="preserve">Three sample sizes appear in this document, which is worth stating once. </w:t>
+      </w:r>
+      <w:r>
+        <w:rPr>
+          <w:b w:val="0"/>
+        </w:rPr>
+        <w:t>5,900 rows is the full validation split and the source of every headline figure. 500 rows is the fixed subset used for the in-training evaluations, chosen so five evaluations cost 49 minutes rather than nine hours. 200 rows is a separate sample drawn for the error analysis in Task 4, and reused here for the raw-versus-normalised comparison and the baseline in section 9, because both of those need per-utterance predictions on disk rather than an aggregate. Every comparison is made within one sample size, never across two.</w:t>
+      </w:r>
+    </w:p>
+    <w:p>
+      <w:r>
+        <w:rPr>
+          <w:b/>
+        </w:rPr>
         <w:t xml:space="preserve">Guards. </w:t>
       </w:r>
       <w:r>
@@ -4008,6 +4022,20 @@
         <w:t>A WER of 8.05% means nothing on its own without knowing what the untouched model scores on the same audio. The baseline was measured by running the identical script with the adapter switched off — same 200 utterances, same seed, same preprocessing, same generation settings, so the only difference between the two columns is the adapter.</w:t>
       </w:r>
     </w:p>
+    <w:p>
+      <w:r>
+        <w:rPr>
+          <w:b/>
+        </w:rPr>
+        <w:t xml:space="preserve">Both columns are the 4-bit NF4 model. </w:t>
+      </w:r>
+      <w:r>
+        <w:rPr>
+          <w:b w:val="0"/>
+        </w:rPr>
+        <w:t>The baseline run used the same quantised load path as everything else, so 37.36% is whisper-large-v3 quantised to NF4 and not the original 16-bit release. That is the comparison worth having, because it isolates the adapter as the single variable, but it is a narrower claim than "Whisper's WER on Persian" and is not offered as one.</w:t>
+      </w:r>
+    </w:p>
     <w:tbl>
       <w:tblPr>
         <w:tblStyle w:val="TableGrid"/>
@@ -4060,7 +4088,7 @@
                 <w:b/>
                 <w:sz w:val="18"/>
               </w:rPr>
-              <w:t>Base whisper-large-v3</w:t>
+              <w:t>Base model, 4-bit</w:t>
             </w:r>
           </w:p>
         </w:tc>

</xml_diff>